<commit_message>
DBMS Notes: deep review, gap-fill & enrichment across all 11 modules (print-ready)
Add-only enrichment (~1,665 new lines) to every module M01-M11; no existing
content removed or reworded. Surgical gap-fill focused on GATE-style numericals
and worked examples: closure X+/candidate keys/minimal cover/BCNF, disk-access
time & RAID write-penalty, B+ tree splits & extendible hashing, join/sort costs,
conflict serializability & precedence graphs, ARIES recovery, CAP/2PC scenarios,
plus SQL worked queries (NULL/NOT IN trap, window functions, correlated subqueries)
and new MCQs. Rebuilt all 11 .docx from markdown via pandoc.

Visuals: 7 new house-style diagrams (matplotlib viz_style.py):
145 join-types, 146 not-in-null-trap, 175 bplus-internal-split,
176 extendible-doubling, 186 heuristic-pushdown, 190 precedence-graph, 191 aries.

Verified: every original line preserved verbatim; all image refs resolve;
each .docx embeds exactly its referenced images.
</commit_message>
<xml_diff>
--- a/SITP/DBMS/Notes/M01_Introduction_Architecture.docx
+++ b/SITP/DBMS/Notes/M01_Introduction_Architecture.docx
@@ -60,7 +60,7 @@
         </w:p>
       </w:sdtContent>
     </w:sdt>
-    <w:bookmarkStart w:id="99" w:name="Xa9fc2830debae9fc90db58b8eb1adf5094cc027"/>
+    <w:bookmarkStart w:id="104" w:name="Xa9fc2830debae9fc90db58b8eb1adf5094cc027"/>
     <w:p>
       <w:pPr>
         <w:pStyle w:val="Heading1"/>
@@ -3113,7 +3113,7 @@
     </w:p>
     <w:bookmarkEnd w:id="27"/>
     <w:bookmarkEnd w:id="28"/>
-    <w:bookmarkStart w:id="35" w:name="Xe6bc5cf2c0317b083c58d342d90b7714862b18b"/>
+    <w:bookmarkStart w:id="36" w:name="Xe6bc5cf2c0317b083c58d342d90b7714862b18b"/>
     <w:p>
       <w:pPr>
         <w:pStyle w:val="Heading2"/>
@@ -3518,6 +3518,560 @@
         <w:t xml:space="preserve">.</w:t>
       </w:r>
     </w:p>
+    <w:bookmarkEnd w:id="34"/>
+    <w:bookmarkStart w:id="35" w:name="worked-example-one-schema-many-instances"/>
+    <w:p>
+      <w:pPr>
+        <w:pStyle w:val="Heading3"/>
+      </w:pPr>
+      <w:r>
+        <w:t xml:space="preserve">Worked example — one schema, many instances</w:t>
+      </w:r>
+    </w:p>
+    <w:p>
+      <w:pPr>
+        <w:pStyle w:val="FirstParagraph"/>
+      </w:pPr>
+      <w:r>
+        <w:t xml:space="preserve">The distinction becomes obvious the moment you see it in code. The</w:t>
+      </w:r>
+      <w:r>
+        <w:t xml:space="preserve"> </w:t>
+      </w:r>
+      <w:r>
+        <w:rPr>
+          <w:b/>
+          <w:bCs/>
+        </w:rPr>
+        <w:t xml:space="preserve">schema</w:t>
+      </w:r>
+      <w:r>
+        <w:t xml:space="preserve"> </w:t>
+      </w:r>
+      <w:r>
+        <w:t xml:space="preserve">is</w:t>
+      </w:r>
+      <w:r>
+        <w:t xml:space="preserve"> </w:t>
+      </w:r>
+      <w:r>
+        <w:t xml:space="preserve">the</w:t>
+      </w:r>
+      <w:r>
+        <w:t xml:space="preserve"> </w:t>
+      </w:r>
+      <w:r>
+        <w:rPr>
+          <w:rStyle w:val="VerbatimChar"/>
+        </w:rPr>
+        <w:t xml:space="preserve">CREATE TABLE</w:t>
+      </w:r>
+      <w:r>
+        <w:t xml:space="preserve"> </w:t>
+      </w:r>
+      <w:r>
+        <w:t xml:space="preserve">line; the</w:t>
+      </w:r>
+      <w:r>
+        <w:t xml:space="preserve"> </w:t>
+      </w:r>
+      <w:r>
+        <w:rPr>
+          <w:b/>
+          <w:bCs/>
+        </w:rPr>
+        <w:t xml:space="preserve">instance</w:t>
+      </w:r>
+      <w:r>
+        <w:t xml:space="preserve"> </w:t>
+      </w:r>
+      <w:r>
+        <w:t xml:space="preserve">is whatever rows happen to be inside</w:t>
+      </w:r>
+      <w:r>
+        <w:t xml:space="preserve"> </w:t>
+      </w:r>
+      <w:r>
+        <w:rPr>
+          <w:i/>
+          <w:iCs/>
+        </w:rPr>
+        <w:t xml:space="preserve">right now</w:t>
+      </w:r>
+      <w:r>
+        <w:t xml:space="preserve">:</w:t>
+      </w:r>
+    </w:p>
+    <w:p>
+      <w:pPr>
+        <w:pStyle w:val="SourceCode"/>
+      </w:pPr>
+      <w:r>
+        <w:rPr>
+          <w:rStyle w:val="CommentTok"/>
+        </w:rPr>
+        <w:t xml:space="preserve">-- SCHEMA (the design; you write this once)</w:t>
+      </w:r>
+      <w:r>
+        <w:br/>
+      </w:r>
+      <w:r>
+        <w:rPr>
+          <w:rStyle w:val="KeywordTok"/>
+        </w:rPr>
+        <w:t xml:space="preserve">CREATE</w:t>
+      </w:r>
+      <w:r>
+        <w:rPr>
+          <w:rStyle w:val="NormalTok"/>
+        </w:rPr>
+        <w:t xml:space="preserve"> </w:t>
+      </w:r>
+      <w:r>
+        <w:rPr>
+          <w:rStyle w:val="KeywordTok"/>
+        </w:rPr>
+        <w:t xml:space="preserve">TABLE</w:t>
+      </w:r>
+      <w:r>
+        <w:rPr>
+          <w:rStyle w:val="NormalTok"/>
+        </w:rPr>
+        <w:t xml:space="preserve"> Student (</w:t>
+      </w:r>
+      <w:r>
+        <w:br/>
+      </w:r>
+      <w:r>
+        <w:rPr>
+          <w:rStyle w:val="NormalTok"/>
+        </w:rPr>
+        <w:t xml:space="preserve">    roll_no </w:t>
+      </w:r>
+      <w:r>
+        <w:rPr>
+          <w:rStyle w:val="DataTypeTok"/>
+        </w:rPr>
+        <w:t xml:space="preserve">INT</w:t>
+      </w:r>
+      <w:r>
+        <w:rPr>
+          <w:rStyle w:val="NormalTok"/>
+        </w:rPr>
+        <w:t xml:space="preserve"> </w:t>
+      </w:r>
+      <w:r>
+        <w:rPr>
+          <w:rStyle w:val="KeywordTok"/>
+        </w:rPr>
+        <w:t xml:space="preserve">PRIMARY</w:t>
+      </w:r>
+      <w:r>
+        <w:rPr>
+          <w:rStyle w:val="NormalTok"/>
+        </w:rPr>
+        <w:t xml:space="preserve"> </w:t>
+      </w:r>
+      <w:r>
+        <w:rPr>
+          <w:rStyle w:val="KeywordTok"/>
+        </w:rPr>
+        <w:t xml:space="preserve">KEY</w:t>
+      </w:r>
+      <w:r>
+        <w:rPr>
+          <w:rStyle w:val="NormalTok"/>
+        </w:rPr>
+        <w:t xml:space="preserve">,</w:t>
+      </w:r>
+      <w:r>
+        <w:br/>
+      </w:r>
+      <w:r>
+        <w:rPr>
+          <w:rStyle w:val="NormalTok"/>
+        </w:rPr>
+        <w:t xml:space="preserve">    name    </w:t>
+      </w:r>
+      <w:r>
+        <w:rPr>
+          <w:rStyle w:val="DataTypeTok"/>
+        </w:rPr>
+        <w:t xml:space="preserve">VARCHAR</w:t>
+      </w:r>
+      <w:r>
+        <w:rPr>
+          <w:rStyle w:val="NormalTok"/>
+        </w:rPr>
+        <w:t xml:space="preserve">(</w:t>
+      </w:r>
+      <w:r>
+        <w:rPr>
+          <w:rStyle w:val="DecValTok"/>
+        </w:rPr>
+        <w:t xml:space="preserve">50</w:t>
+      </w:r>
+      <w:r>
+        <w:rPr>
+          <w:rStyle w:val="NormalTok"/>
+        </w:rPr>
+        <w:t xml:space="preserve">),</w:t>
+      </w:r>
+      <w:r>
+        <w:br/>
+      </w:r>
+      <w:r>
+        <w:rPr>
+          <w:rStyle w:val="NormalTok"/>
+        </w:rPr>
+        <w:t xml:space="preserve">    cgpa    </w:t>
+      </w:r>
+      <w:r>
+        <w:rPr>
+          <w:rStyle w:val="DataTypeTok"/>
+        </w:rPr>
+        <w:t xml:space="preserve">DECIMAL</w:t>
+      </w:r>
+      <w:r>
+        <w:rPr>
+          <w:rStyle w:val="NormalTok"/>
+        </w:rPr>
+        <w:t xml:space="preserve">(</w:t>
+      </w:r>
+      <w:r>
+        <w:rPr>
+          <w:rStyle w:val="DecValTok"/>
+        </w:rPr>
+        <w:t xml:space="preserve">3</w:t>
+      </w:r>
+      <w:r>
+        <w:rPr>
+          <w:rStyle w:val="NormalTok"/>
+        </w:rPr>
+        <w:t xml:space="preserve">,</w:t>
+      </w:r>
+      <w:r>
+        <w:rPr>
+          <w:rStyle w:val="DecValTok"/>
+        </w:rPr>
+        <w:t xml:space="preserve">2</w:t>
+      </w:r>
+      <w:r>
+        <w:rPr>
+          <w:rStyle w:val="NormalTok"/>
+        </w:rPr>
+        <w:t xml:space="preserve">)</w:t>
+      </w:r>
+      <w:r>
+        <w:br/>
+      </w:r>
+      <w:r>
+        <w:rPr>
+          <w:rStyle w:val="NormalTok"/>
+        </w:rPr>
+        <w:t xml:space="preserve">);</w:t>
+      </w:r>
+    </w:p>
+    <w:p>
+      <w:pPr>
+        <w:pStyle w:val="SourceCode"/>
+      </w:pPr>
+      <w:r>
+        <w:rPr>
+          <w:rStyle w:val="VerbatimChar"/>
+        </w:rPr>
+        <w:t xml:space="preserve">INSTANCE at 9:00 AM                    INSTANCE at 5:00 PM (after edits)</w:t>
+      </w:r>
+      <w:r>
+        <w:br/>
+      </w:r>
+      <w:r>
+        <w:rPr>
+          <w:rStyle w:val="VerbatimChar"/>
+        </w:rPr>
+        <w:t xml:space="preserve">roll_no | name  | cgpa                 roll_no | name  | cgpa</w:t>
+      </w:r>
+      <w:r>
+        <w:br/>
+      </w:r>
+      <w:r>
+        <w:rPr>
+          <w:rStyle w:val="VerbatimChar"/>
+        </w:rPr>
+        <w:t xml:space="preserve">--------+-------+-----                 --------+-------+-----</w:t>
+      </w:r>
+      <w:r>
+        <w:br/>
+      </w:r>
+      <w:r>
+        <w:rPr>
+          <w:rStyle w:val="VerbatimChar"/>
+        </w:rPr>
+        <w:t xml:space="preserve">  1     | Asha  | 8.10                    1    | Asha  | 8.40   &lt;- cgpa updated</w:t>
+      </w:r>
+      <w:r>
+        <w:br/>
+      </w:r>
+      <w:r>
+        <w:rPr>
+          <w:rStyle w:val="VerbatimChar"/>
+        </w:rPr>
+        <w:t xml:space="preserve">  2     | Ravi  | 7.55                    3    | Meera | 9.02   &lt;- new row inserted</w:t>
+      </w:r>
+      <w:r>
+        <w:br/>
+      </w:r>
+      <w:r>
+        <w:rPr>
+          <w:rStyle w:val="VerbatimChar"/>
+        </w:rPr>
+        <w:t xml:space="preserve">                                         (row 2 was deleted)</w:t>
+      </w:r>
+    </w:p>
+    <w:p>
+      <w:pPr>
+        <w:pStyle w:val="FirstParagraph"/>
+      </w:pPr>
+      <w:r>
+        <w:t xml:space="preserve">The</w:t>
+      </w:r>
+      <w:r>
+        <w:t xml:space="preserve"> </w:t>
+      </w:r>
+      <w:r>
+        <w:rPr>
+          <w:rStyle w:val="VerbatimChar"/>
+        </w:rPr>
+        <w:t xml:space="preserve">CREATE TABLE</w:t>
+      </w:r>
+      <w:r>
+        <w:t xml:space="preserve"> </w:t>
+      </w:r>
+      <w:r>
+        <w:t xml:space="preserve">(schema) never changed all day — but the</w:t>
+      </w:r>
+      <w:r>
+        <w:t xml:space="preserve"> </w:t>
+      </w:r>
+      <w:r>
+        <w:rPr>
+          <w:b/>
+          <w:bCs/>
+        </w:rPr>
+        <w:t xml:space="preserve">instance</w:t>
+      </w:r>
+      <w:r>
+        <w:t xml:space="preserve"> </w:t>
+      </w:r>
+      <w:r>
+        <w:t xml:space="preserve">changed</w:t>
+      </w:r>
+      <w:r>
+        <w:t xml:space="preserve"> </w:t>
+      </w:r>
+      <w:r>
+        <w:t xml:space="preserve">with</w:t>
+      </w:r>
+      <w:r>
+        <w:t xml:space="preserve"> </w:t>
+      </w:r>
+      <w:r>
+        <w:rPr>
+          <w:i/>
+          <w:iCs/>
+        </w:rPr>
+        <w:t xml:space="preserve">every</w:t>
+      </w:r>
+      <w:r>
+        <w:t xml:space="preserve"> </w:t>
+      </w:r>
+      <w:r>
+        <w:t xml:space="preserve">INSERT / UPDATE / DELETE. That is the whole point:</w:t>
+      </w:r>
+      <w:r>
+        <w:t xml:space="preserve"> </w:t>
+      </w:r>
+      <w:r>
+        <w:rPr>
+          <w:b/>
+          <w:bCs/>
+        </w:rPr>
+        <w:t xml:space="preserve">schema = stable</w:t>
+      </w:r>
+      <w:r>
+        <w:rPr>
+          <w:b/>
+          <w:bCs/>
+        </w:rPr>
+        <w:t xml:space="preserve"> </w:t>
+      </w:r>
+      <w:r>
+        <w:rPr>
+          <w:b/>
+          <w:bCs/>
+        </w:rPr>
+        <w:t xml:space="preserve">type, instance = live value.</w:t>
+      </w:r>
+      <w:r>
+        <w:t xml:space="preserve"> </w:t>
+      </w:r>
+      <w:r>
+        <w:t xml:space="preserve">A database has</w:t>
+      </w:r>
+      <w:r>
+        <w:t xml:space="preserve"> </w:t>
+      </w:r>
+      <w:r>
+        <w:rPr>
+          <w:b/>
+          <w:bCs/>
+        </w:rPr>
+        <w:t xml:space="preserve">exactly one schema</w:t>
+      </w:r>
+      <w:r>
+        <w:t xml:space="preserve"> </w:t>
+      </w:r>
+      <w:r>
+        <w:t xml:space="preserve">but passes</w:t>
+      </w:r>
+      <w:r>
+        <w:t xml:space="preserve"> </w:t>
+      </w:r>
+      <w:r>
+        <w:t xml:space="preserve">through</w:t>
+      </w:r>
+      <w:r>
+        <w:t xml:space="preserve"> </w:t>
+      </w:r>
+      <w:r>
+        <w:rPr>
+          <w:b/>
+          <w:bCs/>
+        </w:rPr>
+        <w:t xml:space="preserve">countless instances</w:t>
+      </w:r>
+      <w:r>
+        <w:t xml:space="preserve"> </w:t>
+      </w:r>
+      <w:r>
+        <w:t xml:space="preserve">over its lifetime.</w:t>
+      </w:r>
+    </w:p>
+    <w:p>
+      <w:pPr>
+        <w:pStyle w:val="BlockText"/>
+      </w:pPr>
+      <w:r>
+        <w:rPr>
+          <w:b/>
+          <w:bCs/>
+        </w:rPr>
+        <w:t xml:space="preserve">Interview follow-up:</w:t>
+      </w:r>
+      <w:r>
+        <w:t xml:space="preserve"> </w:t>
+      </w:r>
+      <w:r>
+        <w:rPr>
+          <w:i/>
+          <w:iCs/>
+        </w:rPr>
+        <w:t xml:space="preserve">“Can two databases share a schema but differ in</w:t>
+      </w:r>
+      <w:r>
+        <w:rPr>
+          <w:i/>
+          <w:iCs/>
+        </w:rPr>
+        <w:t xml:space="preserve"> </w:t>
+      </w:r>
+      <w:r>
+        <w:rPr>
+          <w:i/>
+          <w:iCs/>
+        </w:rPr>
+        <w:t xml:space="preserve">instance?”</w:t>
+      </w:r>
+      <w:r>
+        <w:t xml:space="preserve"> </w:t>
+      </w:r>
+      <w:r>
+        <w:t xml:space="preserve">→</w:t>
+      </w:r>
+      <w:r>
+        <w:t xml:space="preserve"> </w:t>
+      </w:r>
+      <w:r>
+        <w:rPr>
+          <w:b/>
+          <w:bCs/>
+        </w:rPr>
+        <w:t xml:space="preserve">Yes</w:t>
+      </w:r>
+      <w:r>
+        <w:t xml:space="preserve"> </w:t>
+      </w:r>
+      <w:r>
+        <w:t xml:space="preserve">— a</w:t>
+      </w:r>
+      <w:r>
+        <w:t xml:space="preserve"> </w:t>
+      </w:r>
+      <w:r>
+        <w:rPr>
+          <w:rStyle w:val="VerbatimChar"/>
+        </w:rPr>
+        <w:t xml:space="preserve">staging</w:t>
+      </w:r>
+      <w:r>
+        <w:t xml:space="preserve"> </w:t>
+      </w:r>
+      <w:r>
+        <w:t xml:space="preserve">and a</w:t>
+      </w:r>
+      <w:r>
+        <w:t xml:space="preserve"> </w:t>
+      </w:r>
+      <w:r>
+        <w:rPr>
+          <w:rStyle w:val="VerbatimChar"/>
+        </w:rPr>
+        <w:t xml:space="preserve">production</w:t>
+      </w:r>
+      <w:r>
+        <w:t xml:space="preserve"> </w:t>
+      </w:r>
+      <w:r>
+        <w:t xml:space="preserve">database can run the</w:t>
+      </w:r>
+      <w:r>
+        <w:t xml:space="preserve"> </w:t>
+      </w:r>
+      <w:r>
+        <w:t xml:space="preserve">identical</w:t>
+      </w:r>
+      <w:r>
+        <w:t xml:space="preserve"> </w:t>
+      </w:r>
+      <w:r>
+        <w:rPr>
+          <w:rStyle w:val="VerbatimChar"/>
+        </w:rPr>
+        <w:t xml:space="preserve">CREATE TABLE</w:t>
+      </w:r>
+      <w:r>
+        <w:t xml:space="preserve"> </w:t>
+      </w:r>
+      <w:r>
+        <w:t xml:space="preserve">script (same schema) yet hold completely different</w:t>
+      </w:r>
+      <w:r>
+        <w:t xml:space="preserve"> </w:t>
+      </w:r>
+      <w:r>
+        <w:t xml:space="preserve">rows (different instances). This is exactly how test environments are built.</w:t>
+      </w:r>
+    </w:p>
     <w:p>
       <w:r>
         <w:pict>
@@ -3525,9 +4079,9 @@
         </w:pict>
       </w:r>
     </w:p>
-    <w:bookmarkEnd w:id="34"/>
     <w:bookmarkEnd w:id="35"/>
-    <w:bookmarkStart w:id="42" w:name="the-three-schema-ansi-sparc-architecture"/>
+    <w:bookmarkEnd w:id="36"/>
+    <w:bookmarkStart w:id="43" w:name="the-three-schema-ansi-sparc-architecture"/>
     <w:p>
       <w:pPr>
         <w:pStyle w:val="Heading2"/>
@@ -3536,7 +4090,7 @@
         <w:t xml:space="preserve">1.4 The Three-Schema (ANSI-SPARC) Architecture</w:t>
       </w:r>
     </w:p>
-    <w:bookmarkStart w:id="36" w:name="motivation-problem-statement"/>
+    <w:bookmarkStart w:id="37" w:name="motivation-problem-statement"/>
     <w:p>
       <w:pPr>
         <w:pStyle w:val="Heading3"/>
@@ -3649,8 +4203,8 @@
         <w:t xml:space="preserve">and it is the crown jewel of database design.</w:t>
       </w:r>
     </w:p>
-    <w:bookmarkEnd w:id="36"/>
-    <w:bookmarkStart w:id="40" w:name="the-architecture"/>
+    <w:bookmarkEnd w:id="37"/>
+    <w:bookmarkStart w:id="41" w:name="the-architecture"/>
     <w:p>
       <w:pPr>
         <w:pStyle w:val="Heading3"/>
@@ -3668,18 +4222,18 @@
           <wp:inline>
             <wp:extent cx="5334000" cy="3749909"/>
             <wp:effectExtent b="0" l="0" r="0" t="0"/>
-            <wp:docPr descr="ANSI-SPARC three-schema architecture: external views map to one conceptual schema, which maps to one internal schema, which maps to disk." title="" id="38" name="Picture"/>
+            <wp:docPr descr="ANSI-SPARC three-schema architecture: external views map to one conceptual schema, which maps to one internal schema, which maps to disk." title="" id="39" name="Picture"/>
             <a:graphic>
               <a:graphicData uri="http://schemas.openxmlformats.org/drawingml/2006/picture">
                 <pic:pic>
                   <pic:nvPicPr>
-                    <pic:cNvPr descr="images/02_three_schema_architecture.png" id="39" name="Picture"/>
+                    <pic:cNvPr descr="images/02_three_schema_architecture.png" id="40" name="Picture"/>
                     <pic:cNvPicPr>
                       <a:picLocks noChangeArrowheads="1" noChangeAspect="1"/>
                     </pic:cNvPicPr>
                   </pic:nvPicPr>
                   <pic:blipFill>
-                    <a:blip r:embed="rId37"/>
+                    <a:blip r:embed="rId38"/>
                     <a:stretch>
                       <a:fillRect/>
                     </a:stretch>
@@ -3987,8 +4541,8 @@
         <w:t xml:space="preserve">“Many views, one logical truth, one physical reality.”</w:t>
       </w:r>
     </w:p>
-    <w:bookmarkEnd w:id="40"/>
-    <w:bookmarkStart w:id="41" w:name="X7b39cc887b12374af2af53e617c3b721ded14ca"/>
+    <w:bookmarkEnd w:id="41"/>
+    <w:bookmarkStart w:id="42" w:name="X7b39cc887b12374af2af53e617c3b721ded14ca"/>
     <w:p>
       <w:pPr>
         <w:pStyle w:val="Heading3"/>
@@ -4087,9 +4641,9 @@
         </w:pict>
       </w:r>
     </w:p>
-    <w:bookmarkEnd w:id="41"/>
     <w:bookmarkEnd w:id="42"/>
-    <w:bookmarkStart w:id="49" w:name="Xeace1ac390b709fecaa138af9d8ff263cb4a107"/>
+    <w:bookmarkEnd w:id="43"/>
+    <w:bookmarkStart w:id="50" w:name="Xeace1ac390b709fecaa138af9d8ff263cb4a107"/>
     <w:p>
       <w:pPr>
         <w:pStyle w:val="Heading2"/>
@@ -4098,7 +4652,7 @@
         <w:t xml:space="preserve">1.4A Two-Tier vs Three-Tier Architecture (Client–Server)</w:t>
       </w:r>
     </w:p>
-    <w:bookmarkStart w:id="43" w:name="first-kill-the-1-confusion"/>
+    <w:bookmarkStart w:id="44" w:name="first-kill-the-1-confusion"/>
     <w:p>
       <w:pPr>
         <w:pStyle w:val="Heading3"/>
@@ -4384,8 +4938,8 @@
         <w:t xml:space="preserve">Different questions, often asked back-to-back to trick you.</w:t>
       </w:r>
     </w:p>
-    <w:bookmarkEnd w:id="43"/>
-    <w:bookmarkStart w:id="47" w:name="motivation-the-tiers"/>
+    <w:bookmarkEnd w:id="44"/>
+    <w:bookmarkStart w:id="48" w:name="motivation-the-tiers"/>
     <w:p>
       <w:pPr>
         <w:pStyle w:val="Heading3"/>
@@ -4403,18 +4957,18 @@
           <wp:inline>
             <wp:extent cx="5334000" cy="3136766"/>
             <wp:effectExtent b="0" l="0" r="0" t="0"/>
-            <wp:docPr descr="Two-tier: client (UI + logic) talks directly to the DB server via SQL/ODBC. Three-tier: presentation (browser) → application server (logic) → database server; client never touches the DB." title="" id="45" name="Picture"/>
+            <wp:docPr descr="Two-tier: client (UI + logic) talks directly to the DB server via SQL/ODBC. Three-tier: presentation (browser) → application server (logic) → database server; client never touches the DB." title="" id="46" name="Picture"/>
             <a:graphic>
               <a:graphicData uri="http://schemas.openxmlformats.org/drawingml/2006/picture">
                 <pic:pic>
                   <pic:nvPicPr>
-                    <pic:cNvPr descr="images/22_two_vs_three_tier.png" id="46" name="Picture"/>
+                    <pic:cNvPr descr="images/22_two_vs_three_tier.png" id="47" name="Picture"/>
                     <pic:cNvPicPr>
                       <a:picLocks noChangeArrowheads="1" noChangeAspect="1"/>
                     </pic:cNvPicPr>
                   </pic:nvPicPr>
                   <pic:blipFill>
-                    <a:blip r:embed="rId44"/>
+                    <a:blip r:embed="rId45"/>
                     <a:stretch>
                       <a:fillRect/>
                     </a:stretch>
@@ -5103,8 +5657,8 @@
         <w:t xml:space="preserve">the middle tier exists.</w:t>
       </w:r>
     </w:p>
-    <w:bookmarkEnd w:id="47"/>
-    <w:bookmarkStart w:id="48" w:name="concept-check"/>
+    <w:bookmarkEnd w:id="48"/>
+    <w:bookmarkStart w:id="49" w:name="concept-check"/>
     <w:p>
       <w:pPr>
         <w:pStyle w:val="Heading3"/>
@@ -5189,9 +5743,9 @@
         </w:pict>
       </w:r>
     </w:p>
-    <w:bookmarkEnd w:id="48"/>
     <w:bookmarkEnd w:id="49"/>
-    <w:bookmarkStart w:id="57" w:name="data-independence-the-crown-jewel"/>
+    <w:bookmarkEnd w:id="50"/>
+    <w:bookmarkStart w:id="58" w:name="data-independence-the-crown-jewel"/>
     <w:p>
       <w:pPr>
         <w:pStyle w:val="Heading2"/>
@@ -5200,7 +5754,7 @@
         <w:t xml:space="preserve">1.5 Data Independence — The Crown Jewel</w:t>
       </w:r>
     </w:p>
-    <w:bookmarkStart w:id="53" w:name="definition-2"/>
+    <w:bookmarkStart w:id="54" w:name="definition-2"/>
     <w:p>
       <w:pPr>
         <w:pStyle w:val="Heading3"/>
@@ -5263,18 +5817,18 @@
           <wp:inline>
             <wp:extent cx="5334000" cy="3235303"/>
             <wp:effectExtent b="0" l="0" r="0" t="0"/>
-            <wp:docPr descr="Logical data independence shields views from logical changes; physical data independence shields the logical schema from storage changes." title="" id="51" name="Picture"/>
+            <wp:docPr descr="Logical data independence shields views from logical changes; physical data independence shields the logical schema from storage changes." title="" id="52" name="Picture"/>
             <a:graphic>
               <a:graphicData uri="http://schemas.openxmlformats.org/drawingml/2006/picture">
                 <pic:pic>
                   <pic:nvPicPr>
-                    <pic:cNvPr descr="images/04_data_independence.png" id="52" name="Picture"/>
+                    <pic:cNvPr descr="images/04_data_independence.png" id="53" name="Picture"/>
                     <pic:cNvPicPr>
                       <a:picLocks noChangeArrowheads="1" noChangeAspect="1"/>
                     </pic:cNvPicPr>
                   </pic:nvPicPr>
                   <pic:blipFill>
-                    <a:blip r:embed="rId50"/>
+                    <a:blip r:embed="rId51"/>
                     <a:stretch>
                       <a:fillRect/>
                     </a:stretch>
@@ -5677,8 +6231,8 @@
         <w:t xml:space="preserve">it.</w:t>
       </w:r>
     </w:p>
-    <w:bookmarkEnd w:id="53"/>
-    <w:bookmarkStart w:id="54" w:name="X3992f4aa4ff9f3c27bad82750d46f0c73a49d73"/>
+    <w:bookmarkEnd w:id="54"/>
+    <w:bookmarkStart w:id="55" w:name="X3992f4aa4ff9f3c27bad82750d46f0c73a49d73"/>
     <w:p>
       <w:pPr>
         <w:pStyle w:val="Heading3"/>
@@ -5754,8 +6308,8 @@
         <w:t xml:space="preserve">not an implementation.”</w:t>
       </w:r>
     </w:p>
-    <w:bookmarkEnd w:id="54"/>
-    <w:bookmarkStart w:id="55" w:name="common-mistake-very-frequently-tested"/>
+    <w:bookmarkEnd w:id="55"/>
+    <w:bookmarkStart w:id="56" w:name="common-mistake-very-frequently-tested"/>
     <w:p>
       <w:pPr>
         <w:pStyle w:val="Heading3"/>
@@ -5835,8 +6389,8 @@
         <w:t xml:space="preserve">logical schema is untouched.</w:t>
       </w:r>
     </w:p>
-    <w:bookmarkEnd w:id="55"/>
-    <w:bookmarkStart w:id="56" w:name="concept-check-1"/>
+    <w:bookmarkEnd w:id="56"/>
+    <w:bookmarkStart w:id="57" w:name="concept-check-1"/>
     <w:p>
       <w:pPr>
         <w:pStyle w:val="Heading3"/>
@@ -5902,9 +6456,9 @@
         </w:pict>
       </w:r>
     </w:p>
-    <w:bookmarkEnd w:id="56"/>
     <w:bookmarkEnd w:id="57"/>
-    <w:bookmarkStart w:id="65" w:name="database-languages-ddl-dml-dcl-tcl"/>
+    <w:bookmarkEnd w:id="58"/>
+    <w:bookmarkStart w:id="66" w:name="database-languages-ddl-dml-dcl-tcl"/>
     <w:p>
       <w:pPr>
         <w:pStyle w:val="Heading2"/>
@@ -5913,7 +6467,7 @@
         <w:t xml:space="preserve">1.6 Database Languages (DDL / DML / DCL / TCL)</w:t>
       </w:r>
     </w:p>
-    <w:bookmarkStart w:id="61" w:name="motivation-2"/>
+    <w:bookmarkStart w:id="62" w:name="motivation-2"/>
     <w:p>
       <w:pPr>
         <w:pStyle w:val="Heading3"/>
@@ -6030,18 +6584,18 @@
           <wp:inline>
             <wp:extent cx="5334000" cy="2948380"/>
             <wp:effectExtent b="0" l="0" r="0" t="0"/>
-            <wp:docPr descr="SQL sub-languages: DDL defines structure, DML changes data, DCL controls permissions, TCL bounds transactions." title="" id="59" name="Picture"/>
+            <wp:docPr descr="SQL sub-languages: DDL defines structure, DML changes data, DCL controls permissions, TCL bounds transactions." title="" id="60" name="Picture"/>
             <a:graphic>
               <a:graphicData uri="http://schemas.openxmlformats.org/drawingml/2006/picture">
                 <pic:pic>
                   <pic:nvPicPr>
-                    <pic:cNvPr descr="images/06_sql_sublanguages.png" id="60" name="Picture"/>
+                    <pic:cNvPr descr="images/06_sql_sublanguages.png" id="61" name="Picture"/>
                     <pic:cNvPicPr>
                       <a:picLocks noChangeArrowheads="1" noChangeAspect="1"/>
                     </pic:cNvPicPr>
                   </pic:nvPicPr>
                   <pic:blipFill>
-                    <a:blip r:embed="rId58"/>
+                    <a:blip r:embed="rId59"/>
                     <a:stretch>
                       <a:fillRect/>
                     </a:stretch>
@@ -6732,8 +7286,8 @@
         <w:t xml:space="preserve">).</w:t>
       </w:r>
     </w:p>
-    <w:bookmarkEnd w:id="61"/>
-    <w:bookmarkStart w:id="62" w:name="X55db34ea2728a236354c5f53a0d9fb34ee16039"/>
+    <w:bookmarkEnd w:id="62"/>
+    <w:bookmarkStart w:id="63" w:name="X55db34ea2728a236354c5f53a0d9fb34ee16039"/>
     <w:p>
       <w:pPr>
         <w:pStyle w:val="Heading3"/>
@@ -7010,8 +7564,8 @@
         <w:t xml:space="preserve">passive = manual, may be stale.</w:t>
       </w:r>
     </w:p>
-    <w:bookmarkEnd w:id="62"/>
-    <w:bookmarkStart w:id="63" w:name="classic-traps-memorize"/>
+    <w:bookmarkEnd w:id="63"/>
+    <w:bookmarkStart w:id="64" w:name="classic-traps-memorize"/>
     <w:p>
       <w:pPr>
         <w:pStyle w:val="Heading3"/>
@@ -7285,8 +7839,8 @@
         <w:t xml:space="preserve">does not.</w:t>
       </w:r>
     </w:p>
-    <w:bookmarkEnd w:id="63"/>
-    <w:bookmarkStart w:id="64" w:name="mcqs"/>
+    <w:bookmarkEnd w:id="64"/>
+    <w:bookmarkStart w:id="65" w:name="mcqs"/>
     <w:p>
       <w:pPr>
         <w:pStyle w:val="Heading3"/>
@@ -7466,9 +8020,9 @@
         </w:pict>
       </w:r>
     </w:p>
-    <w:bookmarkEnd w:id="64"/>
     <w:bookmarkEnd w:id="65"/>
-    <w:bookmarkStart w:id="68" w:name="a-dbms-vs-rdbms-and-codds-12-rules"/>
+    <w:bookmarkEnd w:id="66"/>
+    <w:bookmarkStart w:id="69" w:name="a-dbms-vs-rdbms-and-codds-12-rules"/>
     <w:p>
       <w:pPr>
         <w:pStyle w:val="Heading2"/>
@@ -7477,7 +8031,7 @@
         <w:t xml:space="preserve">1.6A DBMS vs RDBMS, and Codd’s 12 Rules</w:t>
       </w:r>
     </w:p>
-    <w:bookmarkStart w:id="66" w:name="Xe9eba2c6abe5ef49fd043cee0481e6beb833bd0"/>
+    <w:bookmarkStart w:id="67" w:name="Xe9eba2c6abe5ef49fd043cee0481e6beb833bd0"/>
     <w:p>
       <w:pPr>
         <w:pStyle w:val="Heading3"/>
@@ -7999,8 +8553,8 @@
         <w:t xml:space="preserve">.</w:t>
       </w:r>
     </w:p>
-    <w:bookmarkEnd w:id="66"/>
-    <w:bookmarkStart w:id="67" w:name="X90db79b86f3d8298d5b6e5e61296f57f7a6ddef"/>
+    <w:bookmarkEnd w:id="67"/>
+    <w:bookmarkStart w:id="68" w:name="X90db79b86f3d8298d5b6e5e61296f57f7a6ddef"/>
     <w:p>
       <w:pPr>
         <w:pStyle w:val="Heading3"/>
@@ -8549,9 +9103,9 @@
         </w:pict>
       </w:r>
     </w:p>
-    <w:bookmarkEnd w:id="67"/>
     <w:bookmarkEnd w:id="68"/>
-    <w:bookmarkStart w:id="73" w:name="X334a968b82ce28a13de0d050ef230936660ff9d"/>
+    <w:bookmarkEnd w:id="69"/>
+    <w:bookmarkStart w:id="74" w:name="X334a968b82ce28a13de0d050ef230936660ff9d"/>
     <w:p>
       <w:pPr>
         <w:pStyle w:val="Heading2"/>
@@ -8587,7 +9141,7 @@
         <w:t xml:space="preserve">.</w:t>
       </w:r>
     </w:p>
-    <w:bookmarkStart w:id="69" w:name="X6b481ebad39d122f8e8b8dddb09cfbb2bfa27e7"/>
+    <w:bookmarkStart w:id="70" w:name="X6b481ebad39d122f8e8b8dddb09cfbb2bfa27e7"/>
     <w:p>
       <w:pPr>
         <w:pStyle w:val="Heading3"/>
@@ -9023,8 +9577,8 @@
         <w:t xml:space="preserve">(Modules 9–10).</w:t>
       </w:r>
     </w:p>
-    <w:bookmarkEnd w:id="69"/>
-    <w:bookmarkStart w:id="70" w:name="Xdeb18fb63323287fa0798a96ef1ffcd980bb5f8"/>
+    <w:bookmarkEnd w:id="70"/>
+    <w:bookmarkStart w:id="71" w:name="Xdeb18fb63323287fa0798a96ef1ffcd980bb5f8"/>
     <w:p>
       <w:pPr>
         <w:pStyle w:val="Heading3"/>
@@ -9143,8 +9697,8 @@
         <w:t xml:space="preserve">between tables).</w:t>
       </w:r>
     </w:p>
-    <w:bookmarkEnd w:id="70"/>
-    <w:bookmarkStart w:id="71" w:name="Xb062e2942dcc5629d7a0909119d82bab7a15fbb"/>
+    <w:bookmarkEnd w:id="71"/>
+    <w:bookmarkStart w:id="72" w:name="Xb062e2942dcc5629d7a0909119d82bab7a15fbb"/>
     <w:p>
       <w:pPr>
         <w:pStyle w:val="Heading3"/>
@@ -9332,8 +9886,8 @@
         </w:tc>
       </w:tr>
     </w:tbl>
-    <w:bookmarkEnd w:id="71"/>
-    <w:bookmarkStart w:id="72" w:name="Xc6985f06ef4b5fb87ca57bb047d1309102576ba"/>
+    <w:bookmarkEnd w:id="72"/>
+    <w:bookmarkStart w:id="73" w:name="Xc6985f06ef4b5fb87ca57bb047d1309102576ba"/>
     <w:p>
       <w:pPr>
         <w:pStyle w:val="Heading3"/>
@@ -9684,24 +10238,981 @@
       </w:r>
     </w:p>
     <w:p>
+      <w:pPr>
+        <w:pStyle w:val="BlockText"/>
+      </w:pPr>
+      <w:r>
+        <w:rPr>
+          <w:b/>
+          <w:bCs/>
+        </w:rPr>
+        <w:t xml:space="preserve">Two more dimensions exams love (append to the table above mentally):</w:t>
+      </w:r>
+      <w:r>
+        <w:t xml:space="preserve"> </w:t>
+      </w:r>
+      <w:r>
+        <w:rPr>
+          <w:b/>
+          <w:bCs/>
+        </w:rPr>
+        <w:t xml:space="preserve">Users</w:t>
+      </w:r>
+      <w:r>
+        <w:t xml:space="preserve"> </w:t>
+      </w:r>
+      <w:r>
+        <w:t xml:space="preserve">— OLTP serves</w:t>
+      </w:r>
+      <w:r>
+        <w:t xml:space="preserve"> </w:t>
+      </w:r>
+      <w:r>
+        <w:rPr>
+          <w:i/>
+          <w:iCs/>
+        </w:rPr>
+        <w:t xml:space="preserve">thousands</w:t>
+      </w:r>
+      <w:r>
+        <w:t xml:space="preserve"> </w:t>
+      </w:r>
+      <w:r>
+        <w:t xml:space="preserve">of clerks/customers; OLAP serves a</w:t>
+      </w:r>
+      <w:r>
+        <w:t xml:space="preserve"> </w:t>
+      </w:r>
+      <w:r>
+        <w:rPr>
+          <w:i/>
+          <w:iCs/>
+        </w:rPr>
+        <w:t xml:space="preserve">handful</w:t>
+      </w:r>
+      <w:r>
+        <w:t xml:space="preserve"> </w:t>
+      </w:r>
+      <w:r>
+        <w:t xml:space="preserve">of analysts/managers.</w:t>
+      </w:r>
+      <w:r>
+        <w:t xml:space="preserve"> </w:t>
+      </w:r>
+      <w:r>
+        <w:rPr>
+          <w:b/>
+          <w:bCs/>
+        </w:rPr>
+        <w:t xml:space="preserve">Response time</w:t>
+      </w:r>
+      <w:r>
+        <w:t xml:space="preserve"> </w:t>
+      </w:r>
+      <w:r>
+        <w:t xml:space="preserve">— OLTP must reply in</w:t>
+      </w:r>
+      <w:r>
+        <w:t xml:space="preserve"> </w:t>
+      </w:r>
+      <w:r>
+        <w:rPr>
+          <w:i/>
+          <w:iCs/>
+        </w:rPr>
+        <w:t xml:space="preserve">milliseconds</w:t>
+      </w:r>
+      <w:r>
+        <w:t xml:space="preserve">;</w:t>
+      </w:r>
+      <w:r>
+        <w:t xml:space="preserve"> </w:t>
+      </w:r>
+      <w:r>
+        <w:t xml:space="preserve">OLAP queries may run for</w:t>
+      </w:r>
+      <w:r>
+        <w:t xml:space="preserve"> </w:t>
+      </w:r>
+      <w:r>
+        <w:rPr>
+          <w:i/>
+          <w:iCs/>
+        </w:rPr>
+        <w:t xml:space="preserve">seconds to minutes</w:t>
+      </w:r>
+      <w:r>
+        <w:t xml:space="preserve">.</w:t>
+      </w:r>
+      <w:r>
+        <w:t xml:space="preserve"> </w:t>
+      </w:r>
+      <w:r>
+        <w:rPr>
+          <w:b/>
+          <w:bCs/>
+        </w:rPr>
+        <w:t xml:space="preserve">Source of data</w:t>
+      </w:r>
+      <w:r>
+        <w:t xml:space="preserve"> </w:t>
+      </w:r>
+      <w:r>
+        <w:t xml:space="preserve">— OLTP is the</w:t>
+      </w:r>
+      <w:r>
+        <w:t xml:space="preserve"> </w:t>
+      </w:r>
+      <w:r>
+        <w:rPr>
+          <w:i/>
+          <w:iCs/>
+        </w:rPr>
+        <w:t xml:space="preserve">original</w:t>
+      </w:r>
+      <w:r>
+        <w:t xml:space="preserve"> </w:t>
+      </w:r>
+      <w:r>
+        <w:t xml:space="preserve">source; an OLAP</w:t>
+      </w:r>
+      <w:r>
+        <w:t xml:space="preserve"> </w:t>
+      </w:r>
+      <w:r>
+        <w:rPr>
+          <w:b/>
+          <w:bCs/>
+        </w:rPr>
+        <w:t xml:space="preserve">data warehouse</w:t>
+      </w:r>
+      <w:r>
+        <w:t xml:space="preserve"> </w:t>
+      </w:r>
+      <w:r>
+        <w:t xml:space="preserve">is</w:t>
+      </w:r>
+      <w:r>
+        <w:t xml:space="preserve"> </w:t>
+      </w:r>
+      <w:r>
+        <w:rPr>
+          <w:i/>
+          <w:iCs/>
+        </w:rPr>
+        <w:t xml:space="preserve">loaded (ETL) from</w:t>
+      </w:r>
+      <w:r>
+        <w:t xml:space="preserve"> </w:t>
+      </w:r>
+      <w:r>
+        <w:t xml:space="preserve">the OLTP</w:t>
+      </w:r>
+      <w:r>
+        <w:t xml:space="preserve"> </w:t>
+      </w:r>
+      <w:r>
+        <w:t xml:space="preserve">systems.</w:t>
+      </w:r>
+      <w:r>
+        <w:t xml:space="preserve"> </w:t>
+      </w:r>
+      <w:r>
+        <w:rPr>
+          <w:b/>
+          <w:bCs/>
+        </w:rPr>
+        <w:t xml:space="preserve">Backup criticality</w:t>
+      </w:r>
+      <w:r>
+        <w:t xml:space="preserve"> </w:t>
+      </w:r>
+      <w:r>
+        <w:t xml:space="preserve">— losing OLTP data loses live business; OLAP can</w:t>
+      </w:r>
+      <w:r>
+        <w:t xml:space="preserve"> </w:t>
+      </w:r>
+      <w:r>
+        <w:t xml:space="preserve">be re-derived from OLTP.</w:t>
+      </w:r>
+    </w:p>
+    <w:p>
       <w:r>
         <w:pict>
           <v:rect style="width:0;height:1.5pt" o:hralign="center" o:hrstd="t" o:hr="t"/>
         </w:pict>
       </w:r>
     </w:p>
-    <w:bookmarkEnd w:id="72"/>
     <w:bookmarkEnd w:id="73"/>
-    <w:bookmarkStart w:id="82" w:name="X8b3e6f9d114d371d64ff1a56ed4866c35cb3653"/>
+    <w:bookmarkEnd w:id="74"/>
+    <w:bookmarkStart w:id="77" w:name="Xf6ae06423e9e3224afefd4aea8eec68e7243dbf"/>
     <w:p>
       <w:pPr>
         <w:pStyle w:val="Heading2"/>
       </w:pPr>
       <w:r>
+        <w:t xml:space="preserve">1.6C Why Concurrency Control &amp; Recovery Are Needed (Teasers)</w:t>
+      </w:r>
+    </w:p>
+    <w:p>
+      <w:pPr>
+        <w:pStyle w:val="FirstParagraph"/>
+      </w:pPr>
+      <w:r>
+        <w:t xml:space="preserve">Two of the eight file-system problems in §1.1 —</w:t>
+      </w:r>
+      <w:r>
+        <w:t xml:space="preserve"> </w:t>
+      </w:r>
+      <w:r>
+        <w:rPr>
+          <w:i/>
+          <w:iCs/>
+        </w:rPr>
+        <w:t xml:space="preserve">concurrent-access anomalies</w:t>
+      </w:r>
+      <w:r>
+        <w:t xml:space="preserve"> </w:t>
+      </w:r>
+      <w:r>
+        <w:t xml:space="preserve">and</w:t>
+      </w:r>
+      <w:r>
+        <w:t xml:space="preserve"> </w:t>
+      </w:r>
+      <w:r>
+        <w:rPr>
+          <w:i/>
+          <w:iCs/>
+        </w:rPr>
+        <w:t xml:space="preserve">atomicity problems</w:t>
+      </w:r>
+      <w:r>
+        <w:t xml:space="preserve"> </w:t>
+      </w:r>
+      <w:r>
+        <w:t xml:space="preserve">— are so important that every serious DBMS dedicates a whole</w:t>
+      </w:r>
+      <w:r>
+        <w:t xml:space="preserve"> </w:t>
+      </w:r>
+      <w:r>
+        <w:t xml:space="preserve">subsystem to each. Full treatment is in</w:t>
+      </w:r>
+      <w:r>
+        <w:t xml:space="preserve"> </w:t>
+      </w:r>
+      <w:r>
+        <w:rPr>
+          <w:b/>
+          <w:bCs/>
+        </w:rPr>
+        <w:t xml:space="preserve">Modules 9 (Transactions/Concurrency)</w:t>
+      </w:r>
+      <w:r>
+        <w:t xml:space="preserve"> </w:t>
+      </w:r>
+      <w:r>
+        <w:t xml:space="preserve">and</w:t>
+      </w:r>
+      <w:r>
+        <w:t xml:space="preserve"> </w:t>
+      </w:r>
+      <w:r>
+        <w:rPr>
+          <w:b/>
+          <w:bCs/>
+        </w:rPr>
+        <w:t xml:space="preserve">10 (Recovery)</w:t>
+      </w:r>
+      <w:r>
+        <w:t xml:space="preserve">, but here is the</w:t>
+      </w:r>
+      <w:r>
+        <w:t xml:space="preserve"> </w:t>
+      </w:r>
+      <w:r>
+        <w:rPr>
+          <w:i/>
+          <w:iCs/>
+        </w:rPr>
+        <w:t xml:space="preserve">why</w:t>
+      </w:r>
+      <w:r>
+        <w:t xml:space="preserve">, made concrete, so the rest of the</w:t>
+      </w:r>
+      <w:r>
+        <w:t xml:space="preserve"> </w:t>
+      </w:r>
+      <w:r>
+        <w:t xml:space="preserve">course has a hook to hang on.</w:t>
+      </w:r>
+    </w:p>
+    <w:bookmarkStart w:id="75" w:name="Xa6c11d8324285f0c7cf810675870b0886f7ec46"/>
+    <w:p>
+      <w:pPr>
+        <w:pStyle w:val="Heading3"/>
+      </w:pPr>
+      <w:r>
+        <w:t xml:space="preserve">Why concurrency control? (the</w:t>
+      </w:r>
+      <w:r>
+        <w:t xml:space="preserve"> </w:t>
+      </w:r>
+      <w:r>
+        <w:t xml:space="preserve">“lost update”</w:t>
+      </w:r>
+      <w:r>
+        <w:t xml:space="preserve"> </w:t>
+      </w:r>
+      <w:r>
+        <w:t xml:space="preserve">walkthrough)</w:t>
+      </w:r>
+    </w:p>
+    <w:p>
+      <w:pPr>
+        <w:pStyle w:val="FirstParagraph"/>
+      </w:pPr>
+      <w:r>
+        <w:t xml:space="preserve">Two ATM clerks read the same account (balance ₹1000) at the same moment and each</w:t>
+      </w:r>
+      <w:r>
+        <w:t xml:space="preserve"> </w:t>
+      </w:r>
+      <w:r>
+        <w:t xml:space="preserve">adds a deposit. Without control, one update silently vanishes:</w:t>
+      </w:r>
+    </w:p>
+    <w:p>
+      <w:pPr>
+        <w:pStyle w:val="SourceCode"/>
+      </w:pPr>
+      <w:r>
+        <w:rPr>
+          <w:rStyle w:val="VerbatimChar"/>
+        </w:rPr>
+        <w:t xml:space="preserve">Time  Clerk A (deposit ₹200)      Clerk B (deposit ₹500)      balance on disk</w:t>
+      </w:r>
+      <w:r>
+        <w:br/>
+      </w:r>
+      <w:r>
+        <w:rPr>
+          <w:rStyle w:val="VerbatimChar"/>
+        </w:rPr>
+        <w:t xml:space="preserve">----  -------------------------   -------------------------   ---------------</w:t>
+      </w:r>
+      <w:r>
+        <w:br/>
+      </w:r>
+      <w:r>
+        <w:rPr>
+          <w:rStyle w:val="VerbatimChar"/>
+        </w:rPr>
+        <w:t xml:space="preserve"> t1   read balance = 1000                                          1000</w:t>
+      </w:r>
+      <w:r>
+        <w:br/>
+      </w:r>
+      <w:r>
+        <w:rPr>
+          <w:rStyle w:val="VerbatimChar"/>
+        </w:rPr>
+        <w:t xml:space="preserve"> t2                               read balance = 1000              1000</w:t>
+      </w:r>
+      <w:r>
+        <w:br/>
+      </w:r>
+      <w:r>
+        <w:rPr>
+          <w:rStyle w:val="VerbatimChar"/>
+        </w:rPr>
+        <w:t xml:space="preserve"> t3   compute 1000+200 = 1200                                      1000</w:t>
+      </w:r>
+      <w:r>
+        <w:br/>
+      </w:r>
+      <w:r>
+        <w:rPr>
+          <w:rStyle w:val="VerbatimChar"/>
+        </w:rPr>
+        <w:t xml:space="preserve"> t4                               compute 1000+500 = 1500          1000</w:t>
+      </w:r>
+      <w:r>
+        <w:br/>
+      </w:r>
+      <w:r>
+        <w:rPr>
+          <w:rStyle w:val="VerbatimChar"/>
+        </w:rPr>
+        <w:t xml:space="preserve"> t5   write 1200                                                   1200</w:t>
+      </w:r>
+      <w:r>
+        <w:br/>
+      </w:r>
+      <w:r>
+        <w:rPr>
+          <w:rStyle w:val="VerbatimChar"/>
+        </w:rPr>
+        <w:t xml:space="preserve"> t6                               write 1500  (overwrites!)        1500</w:t>
+      </w:r>
+    </w:p>
+    <w:p>
+      <w:pPr>
+        <w:pStyle w:val="FirstParagraph"/>
+      </w:pPr>
+      <w:r>
+        <w:t xml:space="preserve">The correct final balance is</w:t>
+      </w:r>
+      <w:r>
+        <w:t xml:space="preserve"> </w:t>
+      </w:r>
+      <w:r>
+        <w:rPr>
+          <w:b/>
+          <w:bCs/>
+        </w:rPr>
+        <w:t xml:space="preserve">₹1700</w:t>
+      </w:r>
+      <w:r>
+        <w:t xml:space="preserve">, but the result is</w:t>
+      </w:r>
+      <w:r>
+        <w:t xml:space="preserve"> </w:t>
+      </w:r>
+      <w:r>
+        <w:rPr>
+          <w:b/>
+          <w:bCs/>
+        </w:rPr>
+        <w:t xml:space="preserve">₹1500</w:t>
+      </w:r>
+      <w:r>
+        <w:t xml:space="preserve"> </w:t>
+      </w:r>
+      <w:r>
+        <w:t xml:space="preserve">— Clerk A’s</w:t>
+      </w:r>
+      <w:r>
+        <w:t xml:space="preserve"> </w:t>
+      </w:r>
+      <w:r>
+        <w:t xml:space="preserve">₹200 deposit is</w:t>
+      </w:r>
+      <w:r>
+        <w:t xml:space="preserve"> </w:t>
+      </w:r>
+      <w:r>
+        <w:rPr>
+          <w:b/>
+          <w:bCs/>
+        </w:rPr>
+        <w:t xml:space="preserve">lost</w:t>
+      </w:r>
+      <w:r>
+        <w:t xml:space="preserve">. This is the</w:t>
+      </w:r>
+      <w:r>
+        <w:t xml:space="preserve"> </w:t>
+      </w:r>
+      <w:r>
+        <w:rPr>
+          <w:b/>
+          <w:bCs/>
+        </w:rPr>
+        <w:t xml:space="preserve">lost-update anomaly</w:t>
+      </w:r>
+      <w:r>
+        <w:t xml:space="preserve">.</w:t>
+      </w:r>
+      <w:r>
+        <w:t xml:space="preserve"> </w:t>
+      </w:r>
+      <w:r>
+        <w:rPr>
+          <w:b/>
+          <w:bCs/>
+        </w:rPr>
+        <w:t xml:space="preserve">Concurrency</w:t>
+      </w:r>
+      <w:r>
+        <w:rPr>
+          <w:b/>
+          <w:bCs/>
+        </w:rPr>
+        <w:t xml:space="preserve"> </w:t>
+      </w:r>
+      <w:r>
+        <w:rPr>
+          <w:b/>
+          <w:bCs/>
+        </w:rPr>
+        <w:t xml:space="preserve">control</w:t>
+      </w:r>
+      <w:r>
+        <w:t xml:space="preserve"> </w:t>
+      </w:r>
+      <w:r>
+        <w:t xml:space="preserve">(locking / MVCC, Module 9) prevents it by forcing the two transactions</w:t>
+      </w:r>
+      <w:r>
+        <w:t xml:space="preserve"> </w:t>
+      </w:r>
+      <w:r>
+        <w:t xml:space="preserve">to interleave</w:t>
+      </w:r>
+      <w:r>
+        <w:t xml:space="preserve"> </w:t>
+      </w:r>
+      <w:r>
+        <w:rPr>
+          <w:i/>
+          <w:iCs/>
+        </w:rPr>
+        <w:t xml:space="preserve">safely</w:t>
+      </w:r>
+      <w:r>
+        <w:t xml:space="preserve">, as if they ran one after another (</w:t>
+      </w:r>
+      <w:r>
+        <w:rPr>
+          <w:b/>
+          <w:bCs/>
+        </w:rPr>
+        <w:t xml:space="preserve">serializability</w:t>
+      </w:r>
+      <w:r>
+        <w:t xml:space="preserve">).</w:t>
+      </w:r>
+    </w:p>
+    <w:p>
+      <w:pPr>
+        <w:pStyle w:val="BlockText"/>
+      </w:pPr>
+      <w:r>
+        <w:rPr>
+          <w:b/>
+          <w:bCs/>
+        </w:rPr>
+        <w:t xml:space="preserve">First principles:</w:t>
+      </w:r>
+      <w:r>
+        <w:t xml:space="preserve"> </w:t>
+      </w:r>
+      <w:r>
+        <w:t xml:space="preserve">the bug is not in either program — each is correct alone.</w:t>
+      </w:r>
+      <w:r>
+        <w:t xml:space="preserve"> </w:t>
+      </w:r>
+      <w:r>
+        <w:t xml:space="preserve">It appears</w:t>
+      </w:r>
+      <w:r>
+        <w:t xml:space="preserve"> </w:t>
+      </w:r>
+      <w:r>
+        <w:rPr>
+          <w:i/>
+          <w:iCs/>
+        </w:rPr>
+        <w:t xml:space="preserve">only</w:t>
+      </w:r>
+      <w:r>
+        <w:t xml:space="preserve"> </w:t>
+      </w:r>
+      <w:r>
+        <w:t xml:space="preserve">because they overlap. That is why concurrency is a DBMS</w:t>
+      </w:r>
+      <w:r>
+        <w:t xml:space="preserve"> </w:t>
+      </w:r>
+      <w:r>
+        <w:t xml:space="preserve">responsibility, not the application programmer’s.</w:t>
+      </w:r>
+    </w:p>
+    <w:bookmarkEnd w:id="75"/>
+    <w:bookmarkStart w:id="76" w:name="X0215970a2309e89f67eee39bca37e9509791b8e"/>
+    <w:p>
+      <w:pPr>
+        <w:pStyle w:val="Heading3"/>
+      </w:pPr>
+      <w:r>
+        <w:t xml:space="preserve">Why recovery? (the</w:t>
+      </w:r>
+      <w:r>
+        <w:t xml:space="preserve"> </w:t>
+      </w:r>
+      <w:r>
+        <w:t xml:space="preserve">“crash mid-transfer”</w:t>
+      </w:r>
+      <w:r>
+        <w:t xml:space="preserve"> </w:t>
+      </w:r>
+      <w:r>
+        <w:t xml:space="preserve">walkthrough)</w:t>
+      </w:r>
+    </w:p>
+    <w:p>
+      <w:pPr>
+        <w:pStyle w:val="FirstParagraph"/>
+      </w:pPr>
+      <w:r>
+        <w:t xml:space="preserve">A transfer of ₹500 is two writes:</w:t>
+      </w:r>
+      <w:r>
+        <w:t xml:space="preserve"> </w:t>
+      </w:r>
+      <w:r>
+        <w:rPr>
+          <w:b/>
+          <w:bCs/>
+        </w:rPr>
+        <w:t xml:space="preserve">debit</w:t>
+      </w:r>
+      <w:r>
+        <w:t xml:space="preserve"> </w:t>
+      </w:r>
+      <w:r>
+        <w:t xml:space="preserve">A, then</w:t>
+      </w:r>
+      <w:r>
+        <w:t xml:space="preserve"> </w:t>
+      </w:r>
+      <w:r>
+        <w:rPr>
+          <w:b/>
+          <w:bCs/>
+        </w:rPr>
+        <w:t xml:space="preserve">credit</w:t>
+      </w:r>
+      <w:r>
+        <w:t xml:space="preserve"> </w:t>
+      </w:r>
+      <w:r>
+        <w:t xml:space="preserve">B. If the machine</w:t>
+      </w:r>
+      <w:r>
+        <w:t xml:space="preserve"> </w:t>
+      </w:r>
+      <w:r>
+        <w:t xml:space="preserve">crashes</w:t>
+      </w:r>
+      <w:r>
+        <w:t xml:space="preserve"> </w:t>
+      </w:r>
+      <w:r>
+        <w:rPr>
+          <w:i/>
+          <w:iCs/>
+        </w:rPr>
+        <w:t xml:space="preserve">between</w:t>
+      </w:r>
+      <w:r>
+        <w:t xml:space="preserve"> </w:t>
+      </w:r>
+      <w:r>
+        <w:t xml:space="preserve">them, money simply disappears:</w:t>
+      </w:r>
+    </w:p>
+    <w:p>
+      <w:pPr>
+        <w:pStyle w:val="SourceCode"/>
+      </w:pPr>
+      <w:r>
+        <w:rPr>
+          <w:rStyle w:val="VerbatimChar"/>
+        </w:rPr>
+        <w:t xml:space="preserve">BEGIN transfer ₹500 from A to B</w:t>
+      </w:r>
+      <w:r>
+        <w:br/>
+      </w:r>
+      <w:r>
+        <w:rPr>
+          <w:rStyle w:val="VerbatimChar"/>
+        </w:rPr>
+        <w:t xml:space="preserve">   debit  A: 1000 -&gt; 500     ✓ written</w:t>
+      </w:r>
+      <w:r>
+        <w:br/>
+      </w:r>
+      <w:r>
+        <w:rPr>
+          <w:rStyle w:val="VerbatimChar"/>
+        </w:rPr>
+        <w:t xml:space="preserve">   *** POWER FAILURE ***           &lt;- credit to B never happened</w:t>
+      </w:r>
+      <w:r>
+        <w:br/>
+      </w:r>
+      <w:r>
+        <w:rPr>
+          <w:rStyle w:val="VerbatimChar"/>
+        </w:rPr>
+        <w:t xml:space="preserve">   credit B: ...             ✗</w:t>
+      </w:r>
+      <w:r>
+        <w:br/>
+      </w:r>
+      <w:r>
+        <w:rPr>
+          <w:rStyle w:val="VerbatimChar"/>
+        </w:rPr>
+        <w:t xml:space="preserve">Result without recovery: A lost 500, B gained nothing → ₹500 vanished.</w:t>
+      </w:r>
+    </w:p>
+    <w:p>
+      <w:pPr>
+        <w:pStyle w:val="FirstParagraph"/>
+      </w:pPr>
+      <w:r>
+        <w:t xml:space="preserve">The</w:t>
+      </w:r>
+      <w:r>
+        <w:t xml:space="preserve"> </w:t>
+      </w:r>
+      <w:r>
+        <w:rPr>
+          <w:b/>
+          <w:bCs/>
+        </w:rPr>
+        <w:t xml:space="preserve">recovery manager</w:t>
+      </w:r>
+      <w:r>
+        <w:t xml:space="preserve"> </w:t>
+      </w:r>
+      <w:r>
+        <w:t xml:space="preserve">(Module 10) fixes this using a</w:t>
+      </w:r>
+      <w:r>
+        <w:t xml:space="preserve"> </w:t>
+      </w:r>
+      <w:r>
+        <w:rPr>
+          <w:b/>
+          <w:bCs/>
+        </w:rPr>
+        <w:t xml:space="preserve">write-ahead log</w:t>
+      </w:r>
+      <w:r>
+        <w:t xml:space="preserve">: on</w:t>
+      </w:r>
+      <w:r>
+        <w:t xml:space="preserve"> </w:t>
+      </w:r>
+      <w:r>
+        <w:t xml:space="preserve">restart it sees the transfer never reached</w:t>
+      </w:r>
+      <w:r>
+        <w:t xml:space="preserve"> </w:t>
+      </w:r>
+      <w:r>
+        <w:rPr>
+          <w:rStyle w:val="VerbatimChar"/>
+        </w:rPr>
+        <w:t xml:space="preserve">COMMIT</w:t>
+      </w:r>
+      <w:r>
+        <w:t xml:space="preserve">, so it</w:t>
+      </w:r>
+      <w:r>
+        <w:t xml:space="preserve"> </w:t>
+      </w:r>
+      <w:r>
+        <w:rPr>
+          <w:b/>
+          <w:bCs/>
+        </w:rPr>
+        <w:t xml:space="preserve">undoes</w:t>
+      </w:r>
+      <w:r>
+        <w:t xml:space="preserve"> </w:t>
+      </w:r>
+      <w:r>
+        <w:t xml:space="preserve">the partial</w:t>
+      </w:r>
+      <w:r>
+        <w:t xml:space="preserve"> </w:t>
+      </w:r>
+      <w:r>
+        <w:t xml:space="preserve">debit, restoring A to ₹1000. This is</w:t>
+      </w:r>
+      <w:r>
+        <w:t xml:space="preserve"> </w:t>
+      </w:r>
+      <w:r>
+        <w:rPr>
+          <w:b/>
+          <w:bCs/>
+        </w:rPr>
+        <w:t xml:space="preserve">atomicity</w:t>
+      </w:r>
+      <w:r>
+        <w:t xml:space="preserve"> </w:t>
+      </w:r>
+      <w:r>
+        <w:t xml:space="preserve">(the</w:t>
+      </w:r>
+      <w:r>
+        <w:t xml:space="preserve"> </w:t>
+      </w:r>
+      <w:r>
+        <w:rPr>
+          <w:i/>
+          <w:iCs/>
+        </w:rPr>
+        <w:t xml:space="preserve">A</w:t>
+      </w:r>
+      <w:r>
+        <w:t xml:space="preserve"> </w:t>
+      </w:r>
+      <w:r>
+        <w:t xml:space="preserve">in ACID) in action —</w:t>
+      </w:r>
+      <w:r>
+        <w:t xml:space="preserve"> </w:t>
+      </w:r>
+      <w:r>
+        <w:rPr>
+          <w:i/>
+          <w:iCs/>
+        </w:rPr>
+        <w:t xml:space="preserve">all-or-nothing.</w:t>
+      </w:r>
+      <w:r>
+        <w:t xml:space="preserve"> </w:t>
+      </w:r>
+      <w:r>
+        <w:t xml:space="preserve">Durability (the</w:t>
+      </w:r>
+      <w:r>
+        <w:t xml:space="preserve"> </w:t>
+      </w:r>
+      <w:r>
+        <w:rPr>
+          <w:i/>
+          <w:iCs/>
+        </w:rPr>
+        <w:t xml:space="preserve">D</w:t>
+      </w:r>
+      <w:r>
+        <w:t xml:space="preserve">) is the mirror image: once</w:t>
+      </w:r>
+      <w:r>
+        <w:t xml:space="preserve"> </w:t>
+      </w:r>
+      <w:r>
+        <w:rPr>
+          <w:rStyle w:val="VerbatimChar"/>
+        </w:rPr>
+        <w:t xml:space="preserve">COMMIT</w:t>
+      </w:r>
+      <w:r>
+        <w:t xml:space="preserve"> </w:t>
+      </w:r>
+      <w:r>
+        <w:t xml:space="preserve">is</w:t>
+      </w:r>
+      <w:r>
+        <w:t xml:space="preserve"> </w:t>
+      </w:r>
+      <w:r>
+        <w:t xml:space="preserve">logged, a crash can never</w:t>
+      </w:r>
+      <w:r>
+        <w:t xml:space="preserve"> </w:t>
+      </w:r>
+      <w:r>
+        <w:rPr>
+          <w:i/>
+          <w:iCs/>
+        </w:rPr>
+        <w:t xml:space="preserve">lose</w:t>
+      </w:r>
+      <w:r>
+        <w:t xml:space="preserve"> </w:t>
+      </w:r>
+      <w:r>
+        <w:t xml:space="preserve">the change.</w:t>
+      </w:r>
+    </w:p>
+    <w:p>
+      <w:pPr>
+        <w:pStyle w:val="BlockText"/>
+      </w:pPr>
+      <w:r>
+        <w:rPr>
+          <w:b/>
+          <w:bCs/>
+        </w:rPr>
+        <w:t xml:space="preserve">Exam nugget:</w:t>
+      </w:r>
+      <w:r>
+        <w:t xml:space="preserve"> </w:t>
+      </w:r>
+      <w:r>
+        <w:t xml:space="preserve">concurrency control protects against</w:t>
+      </w:r>
+      <w:r>
+        <w:t xml:space="preserve"> </w:t>
+      </w:r>
+      <w:r>
+        <w:rPr>
+          <w:i/>
+          <w:iCs/>
+        </w:rPr>
+        <w:t xml:space="preserve">other transactions</w:t>
+      </w:r>
+      <w:r>
+        <w:t xml:space="preserve"> </w:t>
+      </w:r>
+      <w:r>
+        <w:t xml:space="preserve">(interference); recovery protects against</w:t>
+      </w:r>
+      <w:r>
+        <w:t xml:space="preserve"> </w:t>
+      </w:r>
+      <w:r>
+        <w:rPr>
+          <w:i/>
+          <w:iCs/>
+        </w:rPr>
+        <w:t xml:space="preserve">failures</w:t>
+      </w:r>
+      <w:r>
+        <w:t xml:space="preserve"> </w:t>
+      </w:r>
+      <w:r>
+        <w:t xml:space="preserve">(crashes/power loss).</w:t>
+      </w:r>
+      <w:r>
+        <w:t xml:space="preserve"> </w:t>
+      </w:r>
+      <w:r>
+        <w:t xml:space="preserve">Different enemies, different subsystems — do not confuse them.</w:t>
+      </w:r>
+    </w:p>
+    <w:p>
+      <w:r>
+        <w:pict>
+          <v:rect style="width:0;height:1.5pt" o:hralign="center" o:hrstd="t" o:hr="t"/>
+        </w:pict>
+      </w:r>
+    </w:p>
+    <w:bookmarkEnd w:id="76"/>
+    <w:bookmarkEnd w:id="77"/>
+    <w:bookmarkStart w:id="86" w:name="X8b3e6f9d114d371d64ff1a56ed4866c35cb3653"/>
+    <w:p>
+      <w:pPr>
+        <w:pStyle w:val="Heading2"/>
+      </w:pPr>
+      <w:r>
         <w:t xml:space="preserve">1.7 DBMS Architecture — How the Engine Is Built Inside</w:t>
       </w:r>
     </w:p>
-    <w:bookmarkStart w:id="77" w:name="the-overall-structure"/>
+    <w:bookmarkStart w:id="81" w:name="the-overall-structure"/>
     <w:p>
       <w:pPr>
         <w:pStyle w:val="Heading3"/>
@@ -9765,18 +11276,18 @@
           <wp:inline>
             <wp:extent cx="5334000" cy="3886316"/>
             <wp:effectExtent b="0" l="0" r="0" t="0"/>
-            <wp:docPr descr="Overall DBMS structure: users on top, Query Processor, Storage Manager, then disk storage with data files, dictionary, and indices." title="" id="75" name="Picture"/>
+            <wp:docPr descr="Overall DBMS structure: users on top, Query Processor, Storage Manager, then disk storage with data files, dictionary, and indices." title="" id="79" name="Picture"/>
             <a:graphic>
               <a:graphicData uri="http://schemas.openxmlformats.org/drawingml/2006/picture">
                 <pic:pic>
                   <pic:nvPicPr>
-                    <pic:cNvPr descr="images/05_dbms_structure.png" id="76" name="Picture"/>
+                    <pic:cNvPr descr="images/05_dbms_structure.png" id="80" name="Picture"/>
                     <pic:cNvPicPr>
                       <a:picLocks noChangeArrowheads="1" noChangeAspect="1"/>
                     </pic:cNvPicPr>
                   </pic:nvPicPr>
                   <pic:blipFill>
-                    <a:blip r:embed="rId74"/>
+                    <a:blip r:embed="rId78"/>
                     <a:stretch>
                       <a:fillRect/>
                     </a:stretch>
@@ -10148,8 +11659,8 @@
         <w:t xml:space="preserve">(used by the optimizer).</w:t>
       </w:r>
     </w:p>
-    <w:bookmarkEnd w:id="77"/>
-    <w:bookmarkStart w:id="81" w:name="dry-run-the-life-of-one-query"/>
+    <w:bookmarkEnd w:id="81"/>
+    <w:bookmarkStart w:id="85" w:name="dry-run-the-life-of-one-query"/>
     <w:p>
       <w:pPr>
         <w:pStyle w:val="Heading3"/>
@@ -10282,18 +11793,18 @@
           <wp:inline>
             <wp:extent cx="5138928" cy="8631936"/>
             <wp:effectExtent b="0" l="0" r="0" t="0"/>
-            <wp:docPr descr="Flowchart — life of a SQL query: parse → authorize → optimize → execute → fetch blocks → ACID → result." title="" id="79" name="Picture"/>
+            <wp:docPr descr="Flowchart — life of a SQL query: parse → authorize → optimize → execute → fetch blocks → ACID → result." title="" id="83" name="Picture"/>
             <a:graphic>
               <a:graphicData uri="http://schemas.openxmlformats.org/drawingml/2006/picture">
                 <pic:pic>
                   <pic:nvPicPr>
-                    <pic:cNvPr descr="images/09_fc_query_flow.png" id="80" name="Picture"/>
+                    <pic:cNvPr descr="images/09_fc_query_flow.png" id="84" name="Picture"/>
                     <pic:cNvPicPr>
                       <a:picLocks noChangeArrowheads="1" noChangeAspect="1"/>
                     </pic:cNvPicPr>
                   </pic:nvPicPr>
                   <pic:blipFill>
-                    <a:blip r:embed="rId78"/>
+                    <a:blip r:embed="rId82"/>
                     <a:stretch>
                       <a:fillRect/>
                     </a:stretch>
@@ -10377,9 +11888,9 @@
         </w:pict>
       </w:r>
     </w:p>
-    <w:bookmarkEnd w:id="81"/>
-    <w:bookmarkEnd w:id="82"/>
-    <w:bookmarkStart w:id="86" w:name="database-users-and-the-dba"/>
+    <w:bookmarkEnd w:id="85"/>
+    <w:bookmarkEnd w:id="86"/>
+    <w:bookmarkStart w:id="91" w:name="database-users-and-the-dba"/>
     <w:p>
       <w:pPr>
         <w:pStyle w:val="Heading2"/>
@@ -10397,18 +11908,18 @@
           <wp:inline>
             <wp:extent cx="5334000" cy="2948380"/>
             <wp:effectExtent b="0" l="0" r="0" t="0"/>
-            <wp:docPr descr="Database users (naive, application programmers, sophisticated, specialized) and the DBA who administers everything." title="" id="84" name="Picture"/>
+            <wp:docPr descr="Database users (naive, application programmers, sophisticated, specialized) and the DBA who administers everything." title="" id="88" name="Picture"/>
             <a:graphic>
               <a:graphicData uri="http://schemas.openxmlformats.org/drawingml/2006/picture">
                 <pic:pic>
                   <pic:nvPicPr>
-                    <pic:cNvPr descr="images/10_users_dba.png" id="85" name="Picture"/>
+                    <pic:cNvPr descr="images/10_users_dba.png" id="89" name="Picture"/>
                     <pic:cNvPicPr>
                       <a:picLocks noChangeArrowheads="1" noChangeAspect="1"/>
                     </pic:cNvPicPr>
                   </pic:nvPicPr>
                   <pic:blipFill>
-                    <a:blip r:embed="rId83"/>
+                    <a:blip r:embed="rId87"/>
                     <a:stretch>
                       <a:fillRect/>
                     </a:stretch>
@@ -10720,6 +12231,496 @@
         <w:t xml:space="preserve">and upgrades.</w:t>
       </w:r>
     </w:p>
+    <w:bookmarkStart w:id="90" w:name="X18251d22a7f537e8ea250fcde69881cea7bbead"/>
+    <w:p>
+      <w:pPr>
+        <w:pStyle w:val="Heading3"/>
+      </w:pPr>
+      <w:r>
+        <w:t xml:space="preserve">Data Administrator (DA) vs Database Administrator (DBA) — a tested distinction</w:t>
+      </w:r>
+    </w:p>
+    <w:p>
+      <w:pPr>
+        <w:pStyle w:val="FirstParagraph"/>
+      </w:pPr>
+      <w:r>
+        <w:t xml:space="preserve">Textbooks (and GfG) split the role into two, and exams ask the difference:</w:t>
+      </w:r>
+    </w:p>
+    <w:tbl>
+      <w:tblPr>
+        <w:tblStyle w:val="Table"/>
+        <w:tblW w:type="pct" w:w="5000"/>
+        <w:tblLayout w:type="fixed"/>
+        <w:tblLook w:firstRow="1" w:lastRow="0" w:firstColumn="0" w:lastColumn="0" w:noHBand="0" w:noVBand="0" w:val="0020"/>
+      </w:tblPr>
+      <w:tblGrid>
+        <w:gridCol w:w="354"/>
+        <w:gridCol w:w="3546"/>
+        <w:gridCol w:w="4019"/>
+      </w:tblGrid>
+      <w:tr>
+        <w:trPr>
+          <w:tblHeader w:val="on"/>
+        </w:trPr>
+        <w:tc>
+          <w:tcPr/>
+          <w:p>
+            <w:pPr>
+              <w:pStyle w:val="Compact"/>
+            </w:pPr>
+          </w:p>
+        </w:tc>
+        <w:tc>
+          <w:tcPr/>
+          <w:p>
+            <w:pPr>
+              <w:pStyle w:val="Compact"/>
+            </w:pPr>
+            <w:r>
+              <w:rPr>
+                <w:b/>
+                <w:bCs/>
+              </w:rPr>
+              <w:t xml:space="preserve">Data Administrator (DA)</w:t>
+            </w:r>
+          </w:p>
+        </w:tc>
+        <w:tc>
+          <w:tcPr/>
+          <w:p>
+            <w:pPr>
+              <w:pStyle w:val="Compact"/>
+            </w:pPr>
+            <w:r>
+              <w:rPr>
+                <w:b/>
+                <w:bCs/>
+              </w:rPr>
+              <w:t xml:space="preserve">Database Administrator (DBA)</w:t>
+            </w:r>
+          </w:p>
+        </w:tc>
+      </w:tr>
+      <w:tr>
+        <w:tc>
+          <w:tcPr/>
+          <w:p>
+            <w:pPr>
+              <w:pStyle w:val="Compact"/>
+            </w:pPr>
+            <w:r>
+              <w:t xml:space="preserve">Nature</w:t>
+            </w:r>
+          </w:p>
+        </w:tc>
+        <w:tc>
+          <w:tcPr/>
+          <w:p>
+            <w:pPr>
+              <w:pStyle w:val="Compact"/>
+            </w:pPr>
+            <w:r>
+              <w:rPr>
+                <w:b/>
+                <w:bCs/>
+              </w:rPr>
+              <w:t xml:space="preserve">managerial / policy</w:t>
+            </w:r>
+          </w:p>
+        </w:tc>
+        <w:tc>
+          <w:tcPr/>
+          <w:p>
+            <w:pPr>
+              <w:pStyle w:val="Compact"/>
+            </w:pPr>
+            <w:r>
+              <w:rPr>
+                <w:b/>
+                <w:bCs/>
+              </w:rPr>
+              <w:t xml:space="preserve">technical / operational</w:t>
+            </w:r>
+          </w:p>
+        </w:tc>
+      </w:tr>
+      <w:tr>
+        <w:tc>
+          <w:tcPr/>
+          <w:p>
+            <w:pPr>
+              <w:pStyle w:val="Compact"/>
+            </w:pPr>
+            <w:r>
+              <w:t xml:space="preserve">Scope</w:t>
+            </w:r>
+          </w:p>
+        </w:tc>
+        <w:tc>
+          <w:tcPr/>
+          <w:p>
+            <w:pPr>
+              <w:pStyle w:val="Compact"/>
+            </w:pPr>
+            <w:r>
+              <w:t xml:space="preserve">the whole</w:t>
+            </w:r>
+            <w:r>
+              <w:t xml:space="preserve"> </w:t>
+            </w:r>
+            <w:r>
+              <w:rPr>
+                <w:b/>
+                <w:bCs/>
+              </w:rPr>
+              <w:t xml:space="preserve">organization’s data</w:t>
+            </w:r>
+          </w:p>
+        </w:tc>
+        <w:tc>
+          <w:tcPr/>
+          <w:p>
+            <w:pPr>
+              <w:pStyle w:val="Compact"/>
+            </w:pPr>
+            <w:r>
+              <w:t xml:space="preserve">a</w:t>
+            </w:r>
+            <w:r>
+              <w:t xml:space="preserve"> </w:t>
+            </w:r>
+            <w:r>
+              <w:rPr>
+                <w:b/>
+                <w:bCs/>
+              </w:rPr>
+              <w:t xml:space="preserve">specific database</w:t>
+            </w:r>
+            <w:r>
+              <w:t xml:space="preserve"> </w:t>
+            </w:r>
+            <w:r>
+              <w:t xml:space="preserve">+ its apps</w:t>
+            </w:r>
+          </w:p>
+        </w:tc>
+      </w:tr>
+      <w:tr>
+        <w:tc>
+          <w:tcPr/>
+          <w:p>
+            <w:pPr>
+              <w:pStyle w:val="Compact"/>
+            </w:pPr>
+            <w:r>
+              <w:t xml:space="preserve">Focuses on</w:t>
+            </w:r>
+          </w:p>
+        </w:tc>
+        <w:tc>
+          <w:tcPr/>
+          <w:p>
+            <w:pPr>
+              <w:pStyle w:val="Compact"/>
+            </w:pPr>
+            <w:r>
+              <w:t xml:space="preserve">data</w:t>
+            </w:r>
+            <w:r>
+              <w:t xml:space="preserve"> </w:t>
+            </w:r>
+            <w:r>
+              <w:rPr>
+                <w:i/>
+                <w:iCs/>
+              </w:rPr>
+              <w:t xml:space="preserve">meaning</w:t>
+            </w:r>
+            <w:r>
+              <w:t xml:space="preserve">, governance, standards, privacy policy</w:t>
+            </w:r>
+          </w:p>
+        </w:tc>
+        <w:tc>
+          <w:tcPr/>
+          <w:p>
+            <w:pPr>
+              <w:pStyle w:val="Compact"/>
+            </w:pPr>
+            <w:r>
+              <w:t xml:space="preserve">install, tune, index, backup, secure the DBMS</w:t>
+            </w:r>
+          </w:p>
+        </w:tc>
+      </w:tr>
+      <w:tr>
+        <w:tc>
+          <w:tcPr/>
+          <w:p>
+            <w:pPr>
+              <w:pStyle w:val="Compact"/>
+            </w:pPr>
+            <w:r>
+              <w:t xml:space="preserve">Sample task</w:t>
+            </w:r>
+          </w:p>
+        </w:tc>
+        <w:tc>
+          <w:tcPr/>
+          <w:p>
+            <w:pPr>
+              <w:pStyle w:val="Compact"/>
+            </w:pPr>
+            <w:r>
+              <w:t xml:space="preserve">“define the enterprise data-retention policy”</w:t>
+            </w:r>
+          </w:p>
+        </w:tc>
+        <w:tc>
+          <w:tcPr/>
+          <w:p>
+            <w:pPr>
+              <w:pStyle w:val="Compact"/>
+            </w:pPr>
+            <w:r>
+              <w:t xml:space="preserve">“add an index, fix a slow query, restore a backup”</w:t>
+            </w:r>
+          </w:p>
+        </w:tc>
+      </w:tr>
+    </w:tbl>
+    <w:p>
+      <w:pPr>
+        <w:pStyle w:val="BlockText"/>
+      </w:pPr>
+      <w:r>
+        <w:rPr>
+          <w:b/>
+          <w:bCs/>
+        </w:rPr>
+        <w:t xml:space="preserve">One-liner:</w:t>
+      </w:r>
+      <w:r>
+        <w:t xml:space="preserve"> </w:t>
+      </w:r>
+      <w:r>
+        <w:rPr>
+          <w:i/>
+          <w:iCs/>
+        </w:rPr>
+        <w:t xml:space="preserve">DA decides</w:t>
+      </w:r>
+      <w:r>
+        <w:rPr>
+          <w:i/>
+          <w:iCs/>
+        </w:rPr>
+        <w:t xml:space="preserve"> </w:t>
+      </w:r>
+      <w:r>
+        <w:rPr>
+          <w:b/>
+          <w:bCs/>
+          <w:i/>
+          <w:iCs/>
+        </w:rPr>
+        <w:t xml:space="preserve">what</w:t>
+      </w:r>
+      <w:r>
+        <w:rPr>
+          <w:i/>
+          <w:iCs/>
+        </w:rPr>
+        <w:t xml:space="preserve"> </w:t>
+      </w:r>
+      <w:r>
+        <w:rPr>
+          <w:i/>
+          <w:iCs/>
+        </w:rPr>
+        <w:t xml:space="preserve">the data should be and</w:t>
+      </w:r>
+      <w:r>
+        <w:rPr>
+          <w:i/>
+          <w:iCs/>
+        </w:rPr>
+        <w:t xml:space="preserve"> </w:t>
+      </w:r>
+      <w:r>
+        <w:rPr>
+          <w:b/>
+          <w:bCs/>
+          <w:i/>
+          <w:iCs/>
+        </w:rPr>
+        <w:t xml:space="preserve">who may</w:t>
+      </w:r>
+      <w:r>
+        <w:rPr>
+          <w:i/>
+          <w:iCs/>
+        </w:rPr>
+        <w:t xml:space="preserve"> </w:t>
+      </w:r>
+      <w:r>
+        <w:rPr>
+          <w:i/>
+          <w:iCs/>
+        </w:rPr>
+        <w:t xml:space="preserve">use it</w:t>
+      </w:r>
+      <w:r>
+        <w:rPr>
+          <w:i/>
+          <w:iCs/>
+        </w:rPr>
+        <w:t xml:space="preserve"> </w:t>
+      </w:r>
+      <w:r>
+        <w:rPr>
+          <w:i/>
+          <w:iCs/>
+        </w:rPr>
+        <w:t xml:space="preserve">(policy); DBA makes the database</w:t>
+      </w:r>
+      <w:r>
+        <w:rPr>
+          <w:i/>
+          <w:iCs/>
+        </w:rPr>
+        <w:t xml:space="preserve"> </w:t>
+      </w:r>
+      <w:r>
+        <w:rPr>
+          <w:b/>
+          <w:bCs/>
+          <w:i/>
+          <w:iCs/>
+        </w:rPr>
+        <w:t xml:space="preserve">run</w:t>
+      </w:r>
+      <w:r>
+        <w:rPr>
+          <w:i/>
+          <w:iCs/>
+        </w:rPr>
+        <w:t xml:space="preserve"> </w:t>
+      </w:r>
+      <w:r>
+        <w:rPr>
+          <w:i/>
+          <w:iCs/>
+        </w:rPr>
+        <w:t xml:space="preserve">it (technology).</w:t>
+      </w:r>
+      <w:r>
+        <w:t xml:space="preserve"> </w:t>
+      </w:r>
+      <w:r>
+        <w:t xml:space="preserve">In small companies one</w:t>
+      </w:r>
+      <w:r>
+        <w:t xml:space="preserve"> </w:t>
+      </w:r>
+      <w:r>
+        <w:t xml:space="preserve">person wears both hats.</w:t>
+      </w:r>
+    </w:p>
+    <w:p>
+      <w:pPr>
+        <w:pStyle w:val="FirstParagraph"/>
+      </w:pPr>
+      <w:r>
+        <w:rPr>
+          <w:b/>
+          <w:bCs/>
+        </w:rPr>
+        <w:t xml:space="preserve">Common DBA sub-specializations (interview colour):</w:t>
+      </w:r>
+      <w:r>
+        <w:t xml:space="preserve"> </w:t>
+      </w:r>
+      <w:r>
+        <w:t xml:space="preserve">an</w:t>
+      </w:r>
+      <w:r>
+        <w:t xml:space="preserve"> </w:t>
+      </w:r>
+      <w:r>
+        <w:rPr>
+          <w:b/>
+          <w:bCs/>
+        </w:rPr>
+        <w:t xml:space="preserve">Administrative/System</w:t>
+      </w:r>
+      <w:r>
+        <w:rPr>
+          <w:b/>
+          <w:bCs/>
+        </w:rPr>
+        <w:t xml:space="preserve"> </w:t>
+      </w:r>
+      <w:r>
+        <w:rPr>
+          <w:b/>
+          <w:bCs/>
+        </w:rPr>
+        <w:t xml:space="preserve">DBA</w:t>
+      </w:r>
+      <w:r>
+        <w:t xml:space="preserve"> </w:t>
+      </w:r>
+      <w:r>
+        <w:t xml:space="preserve">(installs, patches, backs up), an</w:t>
+      </w:r>
+      <w:r>
+        <w:t xml:space="preserve"> </w:t>
+      </w:r>
+      <w:r>
+        <w:rPr>
+          <w:b/>
+          <w:bCs/>
+        </w:rPr>
+        <w:t xml:space="preserve">Application DBA</w:t>
+      </w:r>
+      <w:r>
+        <w:t xml:space="preserve"> </w:t>
+      </w:r>
+      <w:r>
+        <w:t xml:space="preserve">(owns schemas &amp; tuning</w:t>
+      </w:r>
+      <w:r>
+        <w:t xml:space="preserve"> </w:t>
+      </w:r>
+      <w:r>
+        <w:t xml:space="preserve">for one app), and a</w:t>
+      </w:r>
+      <w:r>
+        <w:t xml:space="preserve"> </w:t>
+      </w:r>
+      <w:r>
+        <w:rPr>
+          <w:b/>
+          <w:bCs/>
+        </w:rPr>
+        <w:t xml:space="preserve">Performance DBA</w:t>
+      </w:r>
+      <w:r>
+        <w:t xml:space="preserve"> </w:t>
+      </w:r>
+      <w:r>
+        <w:t xml:space="preserve">(indexes, query plans, capacity). Larger</w:t>
+      </w:r>
+      <w:r>
+        <w:t xml:space="preserve"> </w:t>
+      </w:r>
+      <w:r>
+        <w:t xml:space="preserve">shops split these; smaller shops merge them.</w:t>
+      </w:r>
+    </w:p>
     <w:p>
       <w:pPr>
         <w:pStyle w:val="BlockText"/>
@@ -10773,8 +12774,9 @@
         </w:pict>
       </w:r>
     </w:p>
-    <w:bookmarkEnd w:id="86"/>
-    <w:bookmarkStart w:id="90" w:name="Xd17d44763f9951fb183629b2aa1ae1f14179150"/>
+    <w:bookmarkEnd w:id="90"/>
+    <w:bookmarkEnd w:id="91"/>
+    <w:bookmarkStart w:id="95" w:name="Xd17d44763f9951fb183629b2aa1ae1f14179150"/>
     <w:p>
       <w:pPr>
         <w:pStyle w:val="Heading2"/>
@@ -10806,18 +12808,18 @@
           <wp:inline>
             <wp:extent cx="5334000" cy="6444423"/>
             <wp:effectExtent b="0" l="0" r="0" t="0"/>
-            <wp:docPr descr="Flowchart — Do I need a DBMS? Multiple users, ACID, complex queries, or large secured data → yes; otherwise a flat file may do." title="" id="88" name="Picture"/>
+            <wp:docPr descr="Flowchart — Do I need a DBMS? Multiple users, ACID, complex queries, or large secured data → yes; otherwise a flat file may do." title="" id="93" name="Picture"/>
             <a:graphic>
               <a:graphicData uri="http://schemas.openxmlformats.org/drawingml/2006/picture">
                 <pic:pic>
                   <pic:nvPicPr>
-                    <pic:cNvPr descr="images/08_fc_need_dbms.png" id="89" name="Picture"/>
+                    <pic:cNvPr descr="images/08_fc_need_dbms.png" id="94" name="Picture"/>
                     <pic:cNvPicPr>
                       <a:picLocks noChangeArrowheads="1" noChangeAspect="1"/>
                     </pic:cNvPicPr>
                   </pic:nvPicPr>
                   <pic:blipFill>
-                    <a:blip r:embed="rId87"/>
+                    <a:blip r:embed="rId92"/>
                     <a:stretch>
                       <a:fillRect/>
                     </a:stretch>
@@ -10913,8 +12915,8 @@
         </w:pict>
       </w:r>
     </w:p>
-    <w:bookmarkEnd w:id="90"/>
-    <w:bookmarkStart w:id="91" w:name="X5671dc8eff2f66b51d92c0c83ff21e5111c51a6"/>
+    <w:bookmarkEnd w:id="95"/>
+    <w:bookmarkStart w:id="96" w:name="X5671dc8eff2f66b51d92c0c83ff21e5111c51a6"/>
     <w:p>
       <w:pPr>
         <w:pStyle w:val="Heading2"/>
@@ -11058,8 +13060,8 @@
         </w:pict>
       </w:r>
     </w:p>
-    <w:bookmarkEnd w:id="91"/>
-    <w:bookmarkStart w:id="92" w:name="X61acfcb5b8d1c4feaa159349e59fd399ee029cc"/>
+    <w:bookmarkEnd w:id="96"/>
+    <w:bookmarkStart w:id="97" w:name="X61acfcb5b8d1c4feaa159349e59fd399ee029cc"/>
     <w:p>
       <w:pPr>
         <w:pStyle w:val="Heading2"/>
@@ -11479,8 +13481,8 @@
         </w:pict>
       </w:r>
     </w:p>
-    <w:bookmarkEnd w:id="92"/>
-    <w:bookmarkStart w:id="93" w:name="exam-interview-coding-perspectives"/>
+    <w:bookmarkEnd w:id="97"/>
+    <w:bookmarkStart w:id="98" w:name="exam-interview-coding-perspectives"/>
     <w:p>
       <w:pPr>
         <w:pStyle w:val="Heading2"/>
@@ -11760,8 +13762,8 @@
         </w:pict>
       </w:r>
     </w:p>
-    <w:bookmarkEnd w:id="93"/>
-    <w:bookmarkStart w:id="94" w:name="concept-checks-mcqs-test-yourself"/>
+    <w:bookmarkEnd w:id="98"/>
+    <w:bookmarkStart w:id="99" w:name="concept-checks-mcqs-test-yourself"/>
     <w:p>
       <w:pPr>
         <w:pStyle w:val="Heading2"/>
@@ -12492,6 +14494,373 @@
     </w:p>
     <w:p>
       <w:pPr>
+        <w:pStyle w:val="Compact"/>
+        <w:numPr>
+          <w:ilvl w:val="0"/>
+          <w:numId w:val="1025"/>
+        </w:numPr>
+      </w:pPr>
+      <w:r>
+        <w:t xml:space="preserve">Two transactions both read balance ₹1000, add deposits, and write back; one</w:t>
+      </w:r>
+      <w:r>
+        <w:t xml:space="preserve"> </w:t>
+      </w:r>
+      <w:r>
+        <w:t xml:space="preserve">deposit disappears. This anomaly is called ___ →</w:t>
+      </w:r>
+      <w:r>
+        <w:t xml:space="preserve"> </w:t>
+      </w:r>
+      <w:r>
+        <w:rPr>
+          <w:b/>
+          <w:bCs/>
+        </w:rPr>
+        <w:t xml:space="preserve">lost update</w:t>
+      </w:r>
+      <w:r>
+        <w:t xml:space="preserve"> </w:t>
+      </w:r>
+      <w:r>
+        <w:t xml:space="preserve">(fixed by</w:t>
+      </w:r>
+      <w:r>
+        <w:t xml:space="preserve"> </w:t>
+      </w:r>
+      <w:r>
+        <w:rPr>
+          <w:b/>
+          <w:bCs/>
+        </w:rPr>
+        <w:t xml:space="preserve">concurrency control</w:t>
+      </w:r>
+      <w:r>
+        <w:t xml:space="preserve">).</w:t>
+      </w:r>
+    </w:p>
+    <w:p>
+      <w:pPr>
+        <w:pStyle w:val="Compact"/>
+        <w:numPr>
+          <w:ilvl w:val="0"/>
+          <w:numId w:val="1025"/>
+        </w:numPr>
+      </w:pPr>
+      <w:r>
+        <w:t xml:space="preserve">A crash occurs after debiting A but before crediting B in a transfer. Which</w:t>
+      </w:r>
+      <w:r>
+        <w:t xml:space="preserve"> </w:t>
+      </w:r>
+      <w:r>
+        <w:t xml:space="preserve">subsystem restores atomicity, and how? →</w:t>
+      </w:r>
+      <w:r>
+        <w:t xml:space="preserve"> </w:t>
+      </w:r>
+      <w:r>
+        <w:rPr>
+          <w:b/>
+          <w:bCs/>
+        </w:rPr>
+        <w:t xml:space="preserve">recovery manager</w:t>
+      </w:r>
+      <w:r>
+        <w:t xml:space="preserve">, by</w:t>
+      </w:r>
+      <w:r>
+        <w:t xml:space="preserve"> </w:t>
+      </w:r>
+      <w:r>
+        <w:rPr>
+          <w:b/>
+          <w:bCs/>
+        </w:rPr>
+        <w:t xml:space="preserve">undoing</w:t>
+      </w:r>
+      <w:r>
+        <w:t xml:space="preserve"> </w:t>
+      </w:r>
+      <w:r>
+        <w:t xml:space="preserve">the partial transaction using the</w:t>
+      </w:r>
+      <w:r>
+        <w:t xml:space="preserve"> </w:t>
+      </w:r>
+      <w:r>
+        <w:rPr>
+          <w:b/>
+          <w:bCs/>
+        </w:rPr>
+        <w:t xml:space="preserve">write-ahead log</w:t>
+      </w:r>
+      <w:r>
+        <w:t xml:space="preserve">.</w:t>
+      </w:r>
+    </w:p>
+    <w:p>
+      <w:pPr>
+        <w:pStyle w:val="Compact"/>
+        <w:numPr>
+          <w:ilvl w:val="0"/>
+          <w:numId w:val="1025"/>
+        </w:numPr>
+      </w:pPr>
+      <w:r>
+        <w:t xml:space="preserve">Concurrency control protects against</w:t>
+      </w:r>
+      <w:r>
+        <w:t xml:space="preserve"> </w:t>
+      </w:r>
+      <w:r>
+        <w:rPr>
+          <w:b/>
+          <w:bCs/>
+          <w:i/>
+          <w:iCs/>
+        </w:rPr>
+        <w:t xml:space="preserve">; recovery protects against</w:t>
+      </w:r>
+      <w:r>
+        <w:rPr>
+          <w:b/>
+          <w:bCs/>
+          <w:i/>
+          <w:iCs/>
+        </w:rPr>
+        <w:t xml:space="preserve"> </w:t>
+      </w:r>
+      <w:r>
+        <w:t xml:space="preserve">. →</w:t>
+      </w:r>
+      <w:r>
+        <w:t xml:space="preserve"> </w:t>
+      </w:r>
+      <w:r>
+        <w:rPr>
+          <w:b/>
+          <w:bCs/>
+        </w:rPr>
+        <w:t xml:space="preserve">other transactions (interference)</w:t>
+      </w:r>
+      <w:r>
+        <w:t xml:space="preserve"> </w:t>
+      </w:r>
+      <w:r>
+        <w:t xml:space="preserve">/</w:t>
+      </w:r>
+      <w:r>
+        <w:t xml:space="preserve"> </w:t>
+      </w:r>
+      <w:r>
+        <w:rPr>
+          <w:b/>
+          <w:bCs/>
+        </w:rPr>
+        <w:t xml:space="preserve">failures (crashes)</w:t>
+      </w:r>
+      <w:r>
+        <w:t xml:space="preserve">.</w:t>
+      </w:r>
+    </w:p>
+    <w:p>
+      <w:pPr>
+        <w:pStyle w:val="Compact"/>
+        <w:numPr>
+          <w:ilvl w:val="0"/>
+          <w:numId w:val="1025"/>
+        </w:numPr>
+      </w:pPr>
+      <w:r>
+        <w:t xml:space="preserve">Which role is</w:t>
+      </w:r>
+      <w:r>
+        <w:t xml:space="preserve"> </w:t>
+      </w:r>
+      <w:r>
+        <w:rPr>
+          <w:i/>
+          <w:iCs/>
+        </w:rPr>
+        <w:t xml:space="preserve">managerial and org-wide</w:t>
+      </w:r>
+      <w:r>
+        <w:t xml:space="preserve"> </w:t>
+      </w:r>
+      <w:r>
+        <w:t xml:space="preserve">— DA or DBA? →</w:t>
+      </w:r>
+      <w:r>
+        <w:t xml:space="preserve"> </w:t>
+      </w:r>
+      <w:r>
+        <w:rPr>
+          <w:b/>
+          <w:bCs/>
+        </w:rPr>
+        <w:t xml:space="preserve">Data Administrator</w:t>
+      </w:r>
+      <w:r>
+        <w:rPr>
+          <w:b/>
+          <w:bCs/>
+        </w:rPr>
+        <w:t xml:space="preserve"> </w:t>
+      </w:r>
+      <w:r>
+        <w:rPr>
+          <w:b/>
+          <w:bCs/>
+        </w:rPr>
+        <w:t xml:space="preserve">(DA)</w:t>
+      </w:r>
+      <w:r>
+        <w:t xml:space="preserve">; the</w:t>
+      </w:r>
+      <w:r>
+        <w:t xml:space="preserve"> </w:t>
+      </w:r>
+      <w:r>
+        <w:rPr>
+          <w:b/>
+          <w:bCs/>
+        </w:rPr>
+        <w:t xml:space="preserve">DBA</w:t>
+      </w:r>
+      <w:r>
+        <w:t xml:space="preserve"> </w:t>
+      </w:r>
+      <w:r>
+        <w:t xml:space="preserve">is technical and database-specific.</w:t>
+      </w:r>
+    </w:p>
+    <w:p>
+      <w:pPr>
+        <w:pStyle w:val="Compact"/>
+        <w:numPr>
+          <w:ilvl w:val="0"/>
+          <w:numId w:val="1025"/>
+        </w:numPr>
+      </w:pPr>
+      <w:r>
+        <w:t xml:space="preserve">Same</w:t>
+      </w:r>
+      <w:r>
+        <w:t xml:space="preserve"> </w:t>
+      </w:r>
+      <w:r>
+        <w:rPr>
+          <w:rStyle w:val="VerbatimChar"/>
+        </w:rPr>
+        <w:t xml:space="preserve">CREATE TABLE</w:t>
+      </w:r>
+      <w:r>
+        <w:t xml:space="preserve"> </w:t>
+      </w:r>
+      <w:r>
+        <w:t xml:space="preserve">script, different rows — same</w:t>
+      </w:r>
+      <w:r>
+        <w:t xml:space="preserve"> </w:t>
+      </w:r>
+      <w:r>
+        <w:rPr>
+          <w:b/>
+          <w:bCs/>
+          <w:i/>
+          <w:iCs/>
+        </w:rPr>
+        <w:t xml:space="preserve">, different</w:t>
+      </w:r>
+      <w:r>
+        <w:rPr>
+          <w:b/>
+          <w:bCs/>
+          <w:i/>
+          <w:iCs/>
+        </w:rPr>
+        <w:t xml:space="preserve"> </w:t>
+      </w:r>
+      <w:r>
+        <w:t xml:space="preserve">. →</w:t>
+      </w:r>
+      <w:r>
+        <w:t xml:space="preserve"> </w:t>
+      </w:r>
+      <w:r>
+        <w:rPr>
+          <w:b/>
+          <w:bCs/>
+        </w:rPr>
+        <w:t xml:space="preserve">schema</w:t>
+      </w:r>
+      <w:r>
+        <w:t xml:space="preserve"> </w:t>
+      </w:r>
+      <w:r>
+        <w:t xml:space="preserve">/</w:t>
+      </w:r>
+      <w:r>
+        <w:t xml:space="preserve"> </w:t>
+      </w:r>
+      <w:r>
+        <w:rPr>
+          <w:b/>
+          <w:bCs/>
+        </w:rPr>
+        <w:t xml:space="preserve">instance</w:t>
+      </w:r>
+      <w:r>
+        <w:t xml:space="preserve">.</w:t>
+      </w:r>
+    </w:p>
+    <w:p>
+      <w:pPr>
+        <w:pStyle w:val="Compact"/>
+        <w:numPr>
+          <w:ilvl w:val="0"/>
+          <w:numId w:val="1025"/>
+        </w:numPr>
+      </w:pPr>
+      <w:r>
+        <w:t xml:space="preserve">An OLAP data warehouse is typically</w:t>
+      </w:r>
+      <w:r>
+        <w:t xml:space="preserve"> </w:t>
+      </w:r>
+      <w:r>
+        <w:rPr>
+          <w:i/>
+          <w:iCs/>
+        </w:rPr>
+        <w:t xml:space="preserve">loaded from</w:t>
+      </w:r>
+      <w:r>
+        <w:t xml:space="preserve"> </w:t>
+      </w:r>
+      <w:r>
+        <w:t xml:space="preserve">which kind of system? →</w:t>
+      </w:r>
+      <w:r>
+        <w:t xml:space="preserve"> </w:t>
+      </w:r>
+      <w:r>
+        <w:rPr>
+          <w:b/>
+          <w:bCs/>
+        </w:rPr>
+        <w:t xml:space="preserve">OLTP</w:t>
+      </w:r>
+      <w:r>
+        <w:t xml:space="preserve"> </w:t>
+      </w:r>
+      <w:r>
+        <w:t xml:space="preserve">(via ETL).</w:t>
+      </w:r>
+    </w:p>
+    <w:p>
+      <w:pPr>
         <w:pStyle w:val="FirstParagraph"/>
       </w:pPr>
       <w:r>
@@ -12663,8 +15032,8 @@
         </w:pict>
       </w:r>
     </w:p>
-    <w:bookmarkEnd w:id="94"/>
-    <w:bookmarkStart w:id="97" w:name="one-page-revision-sheet"/>
+    <w:bookmarkEnd w:id="99"/>
+    <w:bookmarkStart w:id="102" w:name="one-page-revision-sheet"/>
     <w:p>
       <w:pPr>
         <w:pStyle w:val="Heading2"/>
@@ -13026,7 +15395,7 @@
         <w:t xml:space="preserve">DBA: schema, security, tuning, backup/recovery, capacity.</w:t>
       </w:r>
     </w:p>
-    <w:bookmarkStart w:id="95" w:name="flash-cards-cover-the-right-side"/>
+    <w:bookmarkStart w:id="100" w:name="flash-cards-cover-the-right-side"/>
     <w:p>
       <w:pPr>
         <w:pStyle w:val="Heading3"/>
@@ -13242,8 +15611,8 @@
         </w:tc>
       </w:tr>
     </w:tbl>
-    <w:bookmarkEnd w:id="95"/>
-    <w:bookmarkStart w:id="96" w:name="spaced-repetition-schedule"/>
+    <w:bookmarkEnd w:id="100"/>
+    <w:bookmarkStart w:id="101" w:name="spaced-repetition-schedule"/>
     <w:p>
       <w:pPr>
         <w:pStyle w:val="Heading3"/>
@@ -13337,9 +15706,9 @@
         </w:pict>
       </w:r>
     </w:p>
-    <w:bookmarkEnd w:id="96"/>
-    <w:bookmarkEnd w:id="97"/>
-    <w:bookmarkStart w:id="98" w:name="summary"/>
+    <w:bookmarkEnd w:id="101"/>
+    <w:bookmarkEnd w:id="102"/>
+    <w:bookmarkStart w:id="103" w:name="summary"/>
     <w:p>
       <w:pPr>
         <w:pStyle w:val="Heading2"/>
@@ -13659,8 +16028,8 @@
         <w:t xml:space="preserve">a query through the engine — all without notes.</w:t>
       </w:r>
     </w:p>
-    <w:bookmarkEnd w:id="98"/>
-    <w:bookmarkEnd w:id="99"/>
+    <w:bookmarkEnd w:id="103"/>
+    <w:bookmarkEnd w:id="104"/>
     <w:sectPr>
       <w:footnotePr>
         <w:numRestart w:val="eachSect"/>

</xml_diff>

<commit_message>
Notes: print-formatting pass — bordered tables + consistent styling (all subjects)
Added a shared pandoc reference.docx (SITP/_build/reference.docx) and rebuilt every
DSA (31), DBMS (11), and OS (24) module .docx with it, for consistent print output:

- Tables now render with a gray cell grid + a bold, light-blue-shaded header row
  with a navy underline (previously borderless — hard to read on paper). The many
  comparison tables across the notes are now clear.
- Consistent typography everywhere: Calibri 12pt body; Heading 1/2/3 = 20/16/14pt;
  Consolas 11pt monospace for code/ASCII diagrams (Gantt charts, trees, DP tables,
  disk-scheduling paths now align correctly).
- Images remain auto-capped to the text width (~5.83in) so none overflow the margin.

Verified: no pandoc errors; every .docx still embeds exactly its referenced images.
</commit_message>
<xml_diff>
--- a/SITP/DBMS/Notes/M01_Introduction_Architecture.docx
+++ b/SITP/DBMS/Notes/M01_Introduction_Architecture.docx
@@ -17083,24 +17083,34 @@
   <w:style w:default="1" w:styleId="Table" w:type="table">
     <w:name w:val="Table"/>
     <w:basedOn w:val="TableNormal"/>
-    <w:semiHidden/>
-    <w:unhideWhenUsed/>
     <w:qFormat/>
     <w:tblPr>
       <w:tblInd w:type="dxa" w:w="0"/>
+      <w:tblBorders>
+        <w:top w:color="808080" w:space="0" w:sz="4" w:val="single"/>
+        <w:left w:color="808080" w:space="0" w:sz="4" w:val="single"/>
+        <w:bottom w:color="808080" w:space="0" w:sz="4" w:val="single"/>
+        <w:right w:color="808080" w:space="0" w:sz="4" w:val="single"/>
+        <w:insideH w:color="BFBFBF" w:space="0" w:sz="4" w:val="single"/>
+        <w:insideV w:color="BFBFBF" w:space="0" w:sz="4" w:val="single"/>
+      </w:tblBorders>
       <w:tblCellMar>
-        <w:top w:type="dxa" w:w="0"/>
+        <w:top w:type="dxa" w:w="40"/>
         <w:left w:type="dxa" w:w="108"/>
-        <w:bottom w:type="dxa" w:w="0"/>
+        <w:bottom w:type="dxa" w:w="40"/>
         <w:right w:type="dxa" w:w="108"/>
       </w:tblCellMar>
     </w:tblPr>
     <w:tblStylePr w:type="firstRow">
+      <w:rPr>
+        <w:b/>
+      </w:rPr>
       <w:tcPr>
+        <w:shd w:color="auto" w:fill="DDEBF7" w:val="clear"/>
         <w:tcBorders>
-          <w:bottom w:val="single"/>
+          <w:bottom w:color="1F4E78" w:space="0" w:sz="8" w:val="single"/>
         </w:tcBorders>
-        <w:vAlign w:val="bottom"/>
+        <w:vAlign w:val="center"/>
       </w:tcPr>
     </w:tblStylePr>
   </w:style>

</xml_diff>